<commit_message>
Acceso y navegacion desde el movil (DV-35 a DV-38)
</commit_message>
<xml_diff>
--- a/documentacion/AN050-diseño-ui-ux.docx
+++ b/documentacion/AN050-diseño-ui-ux.docx
@@ -255,7 +255,7 @@
             </w:pPr>
             <w:r>
               <w:rPr/>
-              <w:t>1.2</w:t>
+              <w:t>1.3</w:t>
             </w:r>
           </w:p>
         </w:tc>
@@ -907,6 +907,109 @@
           </w:p>
         </w:tc>
       </w:tr>
+      <w:tr>
+        <w:trPr/>
+        <w:tc>
+          <w:tcPr>
+            <w:tcW w:w="995" w:type="dxa"/>
+            <w:tcBorders/>
+            <w:vAlign w:val="center"/>
+          </w:tcPr>
+          <w:p>
+            <w:pPr>
+              <w:pStyle w:val="Contenidodelatabla"/>
+              <w:bidi w:val="0"/>
+              <w:spacing w:before="0" w:after="120"/>
+              <w:jc w:val="left"/>
+              <w:rPr/>
+            </w:pPr>
+            <w:r>
+              <w:rPr/>
+              <w:t>1.3</w:t>
+            </w:r>
+          </w:p>
+        </w:tc>
+        <w:tc>
+          <w:tcPr>
+            <w:tcW w:w="1310" w:type="dxa"/>
+            <w:tcBorders/>
+            <w:vAlign w:val="center"/>
+          </w:tcPr>
+          <w:p>
+            <w:pPr>
+              <w:pStyle w:val="Contenidodelatabla"/>
+              <w:bidi w:val="0"/>
+              <w:spacing w:before="0" w:after="120"/>
+              <w:jc w:val="left"/>
+              <w:rPr/>
+            </w:pPr>
+            <w:r>
+              <w:rPr/>
+              <w:t>2026-09-17</w:t>
+            </w:r>
+          </w:p>
+        </w:tc>
+        <w:tc>
+          <w:tcPr>
+            <w:tcW w:w="890" w:type="dxa"/>
+            <w:tcBorders/>
+            <w:vAlign w:val="center"/>
+          </w:tcPr>
+          <w:p>
+            <w:pPr>
+              <w:pStyle w:val="Contenidodelatabla"/>
+              <w:bidi w:val="0"/>
+              <w:spacing w:before="0" w:after="120"/>
+              <w:jc w:val="left"/>
+              <w:rPr/>
+            </w:pPr>
+            <w:r>
+              <w:rPr/>
+              <w:t>D. Quispe</w:t>
+            </w:r>
+          </w:p>
+        </w:tc>
+        <w:tc>
+          <w:tcPr>
+            <w:tcW w:w="6217" w:type="dxa"/>
+            <w:tcBorders/>
+            <w:vAlign w:val="center"/>
+          </w:tcPr>
+          <w:p>
+            <w:pPr>
+              <w:pStyle w:val="Contenidodelatabla"/>
+              <w:bidi w:val="0"/>
+              <w:spacing w:before="0" w:after="120"/>
+              <w:jc w:val="left"/>
+              <w:rPr/>
+            </w:pPr>
+            <w:r>
+              <w:rPr/>
+              <w:t xml:space="preserve">Cotejo desde un teléfono (DV-35 a DV-38). </w:t>
+            </w:r>
+            <w:r>
+              <w:rPr>
+                <w:rStyle w:val="Textooriginal"/>
+              </w:rPr>
+              <w:t>login</w:t>
+            </w:r>
+            <w:r>
+              <w:rPr/>
+              <w:t xml:space="preserve"> con bloque de marca a tres líneas centradas y conmutador de visibilidad en la contraseña; campo de correo saneado contra la autocorrección del móvil; el pie del menú muestra la cuenta que ha entrado en vez de un rótulo fijo; avatar de cuenta en la cabecera para poder salir en móvil; el alto del shell pasa a </w:t>
+            </w:r>
+            <w:r>
+              <w:rPr>
+                <w:rStyle w:val="Textooriginal"/>
+              </w:rPr>
+              <w:t>dvh</w:t>
+            </w:r>
+            <w:r>
+              <w:rPr/>
+              <w:t xml:space="preserve"> para que la barra inferior no se desplace.</w:t>
+            </w:r>
+          </w:p>
+        </w:tc>
+      </w:tr>
     </w:tbl>
     <w:p>
       <w:pPr>
@@ -7490,7 +7593,7 @@
       </w:pPr>
       <w:r>
         <w:rPr/>
-        <w:t xml:space="preserve">Tarjeta centrada de 360 px sobre </w:t>
+        <w:t xml:space="preserve">Tarjeta centrada sobre </w:t>
       </w:r>
       <w:r>
         <w:rPr>
@@ -7500,17 +7603,17 @@
       </w:r>
       <w:r>
         <w:rPr/>
-        <w:t xml:space="preserve">, sin app shell: título de la aplicación a dos líneas, subtítulo "Ingrese sus credenciales", dos campos </w:t>
-      </w:r>
-      <w:r>
-        <w:rPr>
-          <w:rStyle w:val="Strong"/>
-        </w:rPr>
-        <w:t>rellenos</w:t>
-      </w:r>
-      <w:r>
-        <w:rPr/>
-        <w:t xml:space="preserve"> -correo y contraseña- y un botón "Entrar" alineado a la derecha. Mientras valida, una barra de progreso indeterminada corona la tarjeta.</w:t>
+        <w:t xml:space="preserve">, sin app shell. Ancho </w:t>
+      </w:r>
+      <w:r>
+        <w:rPr>
+          <w:rStyle w:val="Textooriginal"/>
+        </w:rPr>
+        <w:t>min(360px, 100%)</w:t>
+      </w:r>
+      <w:r>
+        <w:rPr/>
+        <w:t xml:space="preserve"> dentro de un contenedor con 16 px de relleno: en el escritorio son los 360 px de siempre y en un teléfono de 360 px la tarjeta deja margen a los dos lados en vez de morder los bordes.</w:t>
       </w:r>
     </w:p>
     <w:p>
@@ -7521,37 +7624,565 @@
       </w:pPr>
       <w:r>
         <w:rPr/>
-        <w:t xml:space="preserve">Es la única pantalla que conserva la plantilla del curso. El acceso (RF-18) es de </w:t>
-      </w:r>
+        <w:t>De arriba abajo:</w:t>
+      </w:r>
+    </w:p>
+    <w:tbl>
+      <w:tblPr>
+        <w:tblW w:w="9412" w:type="dxa"/>
+        <w:jc w:val="left"/>
+        <w:tblInd w:w="28" w:type="dxa"/>
+        <w:tblLayout w:type="fixed"/>
+        <w:tblCellMar>
+          <w:top w:w="28" w:type="dxa"/>
+          <w:left w:w="28" w:type="dxa"/>
+          <w:bottom w:w="28" w:type="dxa"/>
+          <w:right w:w="28" w:type="dxa"/>
+        </w:tblCellMar>
+      </w:tblPr>
+      <w:tblGrid>
+        <w:gridCol w:w="1310"/>
+        <w:gridCol w:w="8102"/>
+      </w:tblGrid>
+      <w:tr>
+        <w:trPr>
+          <w:tblHeader w:val="true"/>
+        </w:trPr>
+        <w:tc>
+          <w:tcPr>
+            <w:tcW w:w="1310" w:type="dxa"/>
+            <w:tcBorders/>
+            <w:vAlign w:val="center"/>
+          </w:tcPr>
+          <w:p>
+            <w:pPr>
+              <w:pStyle w:val="Ttulodelatabla"/>
+              <w:suppressLineNumbers/>
+              <w:shd w:fill="EEF1FD" w:val="clear"/>
+              <w:bidi w:val="0"/>
+              <w:spacing w:before="0" w:after="120"/>
+              <w:jc w:val="left"/>
+              <w:rPr/>
+            </w:pPr>
+            <w:r>
+              <w:rPr/>
+              <w:t>Bloque</w:t>
+            </w:r>
+          </w:p>
+        </w:tc>
+        <w:tc>
+          <w:tcPr>
+            <w:tcW w:w="8102" w:type="dxa"/>
+            <w:tcBorders/>
+            <w:vAlign w:val="center"/>
+          </w:tcPr>
+          <w:p>
+            <w:pPr>
+              <w:pStyle w:val="Ttulodelatabla"/>
+              <w:suppressLineNumbers/>
+              <w:shd w:fill="EEF1FD" w:val="clear"/>
+              <w:bidi w:val="0"/>
+              <w:spacing w:before="0" w:after="120"/>
+              <w:jc w:val="left"/>
+              <w:rPr/>
+            </w:pPr>
+            <w:r>
+              <w:rPr/>
+              <w:t>Especificación</w:t>
+            </w:r>
+          </w:p>
+        </w:tc>
+      </w:tr>
+      <w:tr>
+        <w:trPr/>
+        <w:tc>
+          <w:tcPr>
+            <w:tcW w:w="1310" w:type="dxa"/>
+            <w:tcBorders/>
+            <w:vAlign w:val="center"/>
+          </w:tcPr>
+          <w:p>
+            <w:pPr>
+              <w:pStyle w:val="Contenidodelatabla"/>
+              <w:bidi w:val="0"/>
+              <w:spacing w:before="0" w:after="120"/>
+              <w:jc w:val="left"/>
+              <w:rPr/>
+            </w:pPr>
+            <w:r>
+              <w:rPr>
+                <w:rStyle w:val="Strong"/>
+              </w:rPr>
+              <w:t>Marca</w:t>
+            </w:r>
+            <w:r>
+              <w:rPr/>
+              <w:t>, centrada</w:t>
+            </w:r>
+          </w:p>
+        </w:tc>
+        <w:tc>
+          <w:tcPr>
+            <w:tcW w:w="8102" w:type="dxa"/>
+            <w:tcBorders/>
+            <w:vAlign w:val="center"/>
+          </w:tcPr>
+          <w:p>
+            <w:pPr>
+              <w:pStyle w:val="Contenidodelatabla"/>
+              <w:bidi w:val="0"/>
+              <w:spacing w:before="0" w:after="120"/>
+              <w:jc w:val="left"/>
+              <w:rPr/>
+            </w:pPr>
+            <w:r>
+              <w:rPr/>
+              <w:t xml:space="preserve">Icono </w:t>
+            </w:r>
+            <w:r>
+              <w:rPr>
+                <w:rStyle w:val="Textooriginal"/>
+              </w:rPr>
+              <w:t>menu_book</w:t>
+            </w:r>
+            <w:r>
+              <w:rPr/>
+              <w:t xml:space="preserve"> de 40 px en </w:t>
+            </w:r>
+            <w:r>
+              <w:rPr>
+                <w:rStyle w:val="Textooriginal"/>
+              </w:rPr>
+              <w:t>Primary</w:t>
+            </w:r>
+            <w:r>
+              <w:rPr/>
+              <w:t xml:space="preserve">; debajo las siglas </w:t>
+            </w:r>
+            <w:r>
+              <w:rPr>
+                <w:rStyle w:val="Strong"/>
+              </w:rPr>
+              <w:t>SIGBI</w:t>
+            </w:r>
+            <w:r>
+              <w:rPr/>
+              <w:t xml:space="preserve"> en Lora SemiBold 28/36; debajo </w:t>
+            </w:r>
+            <w:r>
+              <w:rPr>
+                <w:rStyle w:val="Strong"/>
+              </w:rPr>
+              <w:t>Sistema de Gestión Bibliotecaria Inteligente</w:t>
+            </w:r>
+            <w:r>
+              <w:rPr/>
+              <w:t xml:space="preserve"> en 12/16, </w:t>
+            </w:r>
+            <w:r>
+              <w:rPr>
+                <w:rStyle w:val="Textooriginal"/>
+              </w:rPr>
+              <w:t>On Surface Variant</w:t>
+            </w:r>
+          </w:p>
+        </w:tc>
+      </w:tr>
+      <w:tr>
+        <w:trPr/>
+        <w:tc>
+          <w:tcPr>
+            <w:tcW w:w="1310" w:type="dxa"/>
+            <w:tcBorders/>
+            <w:vAlign w:val="center"/>
+          </w:tcPr>
+          <w:p>
+            <w:pPr>
+              <w:pStyle w:val="Contenidodelatabla"/>
+              <w:bidi w:val="0"/>
+              <w:spacing w:before="0" w:after="120"/>
+              <w:jc w:val="left"/>
+              <w:rPr/>
+            </w:pPr>
+            <w:r>
+              <w:rPr/>
+              <w:t>Subtítulo</w:t>
+            </w:r>
+          </w:p>
+        </w:tc>
+        <w:tc>
+          <w:tcPr>
+            <w:tcW w:w="8102" w:type="dxa"/>
+            <w:tcBorders/>
+            <w:vAlign w:val="center"/>
+          </w:tcPr>
+          <w:p>
+            <w:pPr>
+              <w:pStyle w:val="Contenidodelatabla"/>
+              <w:bidi w:val="0"/>
+              <w:spacing w:before="0" w:after="120"/>
+              <w:jc w:val="left"/>
+              <w:rPr/>
+            </w:pPr>
+            <w:r>
+              <w:rPr/>
+              <w:t xml:space="preserve">"Ingrese sus credenciales", centrado, </w:t>
+            </w:r>
+            <w:r>
+              <w:rPr>
+                <w:rStyle w:val="Textooriginal"/>
+              </w:rPr>
+              <w:t>On Surface Variant</w:t>
+            </w:r>
+          </w:p>
+        </w:tc>
+      </w:tr>
+      <w:tr>
+        <w:trPr/>
+        <w:tc>
+          <w:tcPr>
+            <w:tcW w:w="1310" w:type="dxa"/>
+            <w:tcBorders/>
+            <w:vAlign w:val="center"/>
+          </w:tcPr>
+          <w:p>
+            <w:pPr>
+              <w:pStyle w:val="Contenidodelatabla"/>
+              <w:bidi w:val="0"/>
+              <w:spacing w:before="0" w:after="120"/>
+              <w:jc w:val="left"/>
+              <w:rPr/>
+            </w:pPr>
+            <w:r>
+              <w:rPr/>
+              <w:t>Correo</w:t>
+            </w:r>
+          </w:p>
+        </w:tc>
+        <w:tc>
+          <w:tcPr>
+            <w:tcW w:w="8102" w:type="dxa"/>
+            <w:tcBorders/>
+            <w:vAlign w:val="center"/>
+          </w:tcPr>
+          <w:p>
+            <w:pPr>
+              <w:pStyle w:val="Contenidodelatabla"/>
+              <w:bidi w:val="0"/>
+              <w:spacing w:before="0" w:after="120"/>
+              <w:jc w:val="left"/>
+              <w:rPr/>
+            </w:pPr>
+            <w:r>
+              <w:rPr/>
+              <w:t xml:space="preserve">Campo relleno. </w:t>
+            </w:r>
+            <w:r>
+              <w:rPr>
+                <w:rStyle w:val="Textooriginal"/>
+              </w:rPr>
+              <w:t>type="email"</w:t>
+            </w:r>
+            <w:r>
+              <w:rPr/>
+              <w:t xml:space="preserve"> con </w:t>
+            </w:r>
+            <w:r>
+              <w:rPr>
+                <w:rStyle w:val="Textooriginal"/>
+              </w:rPr>
+              <w:t>inputmode="email"</w:t>
+            </w:r>
+            <w:r>
+              <w:rPr/>
+              <w:t xml:space="preserve">, </w:t>
+            </w:r>
+            <w:r>
+              <w:rPr>
+                <w:rStyle w:val="Textooriginal"/>
+              </w:rPr>
+              <w:t>autocapitalize="none"</w:t>
+            </w:r>
+            <w:r>
+              <w:rPr/>
+              <w:t xml:space="preserve">, </w:t>
+            </w:r>
+            <w:r>
+              <w:rPr>
+                <w:rStyle w:val="Textooriginal"/>
+              </w:rPr>
+              <w:t>autocorrect="off"</w:t>
+            </w:r>
+            <w:r>
+              <w:rPr/>
+              <w:t xml:space="preserve"> y </w:t>
+            </w:r>
+            <w:r>
+              <w:rPr>
+                <w:rStyle w:val="Textooriginal"/>
+              </w:rPr>
+              <w:t>spellcheck="false"</w:t>
+            </w:r>
+          </w:p>
+        </w:tc>
+      </w:tr>
+      <w:tr>
+        <w:trPr/>
+        <w:tc>
+          <w:tcPr>
+            <w:tcW w:w="1310" w:type="dxa"/>
+            <w:tcBorders/>
+            <w:vAlign w:val="center"/>
+          </w:tcPr>
+          <w:p>
+            <w:pPr>
+              <w:pStyle w:val="Contenidodelatabla"/>
+              <w:bidi w:val="0"/>
+              <w:spacing w:before="0" w:after="120"/>
+              <w:jc w:val="left"/>
+              <w:rPr/>
+            </w:pPr>
+            <w:r>
+              <w:rPr/>
+              <w:t>Contraseña</w:t>
+            </w:r>
+          </w:p>
+        </w:tc>
+        <w:tc>
+          <w:tcPr>
+            <w:tcW w:w="8102" w:type="dxa"/>
+            <w:tcBorders/>
+            <w:vAlign w:val="center"/>
+          </w:tcPr>
+          <w:p>
+            <w:pPr>
+              <w:pStyle w:val="Contenidodelatabla"/>
+              <w:bidi w:val="0"/>
+              <w:spacing w:before="0" w:after="120"/>
+              <w:jc w:val="left"/>
+              <w:rPr/>
+            </w:pPr>
+            <w:r>
+              <w:rPr/>
+              <w:t xml:space="preserve">Campo relleno con </w:t>
+            </w:r>
+            <w:r>
+              <w:rPr>
+                <w:rStyle w:val="Strong"/>
+              </w:rPr>
+              <w:t>conmutador de visibilidad</w:t>
+            </w:r>
+            <w:r>
+              <w:rPr/>
+              <w:t xml:space="preserve"> al final (</w:t>
+            </w:r>
+            <w:r>
+              <w:rPr>
+                <w:rStyle w:val="Textooriginal"/>
+              </w:rPr>
+              <w:t>visibility</w:t>
+            </w:r>
+            <w:r>
+              <w:rPr/>
+              <w:t xml:space="preserve"> / </w:t>
+            </w:r>
+            <w:r>
+              <w:rPr>
+                <w:rStyle w:val="Textooriginal"/>
+              </w:rPr>
+              <w:t>visibility_off</w:t>
+            </w:r>
+            <w:r>
+              <w:rPr/>
+              <w:t>)</w:t>
+            </w:r>
+          </w:p>
+        </w:tc>
+      </w:tr>
+      <w:tr>
+        <w:trPr/>
+        <w:tc>
+          <w:tcPr>
+            <w:tcW w:w="1310" w:type="dxa"/>
+            <w:tcBorders/>
+            <w:vAlign w:val="center"/>
+          </w:tcPr>
+          <w:p>
+            <w:pPr>
+              <w:pStyle w:val="Contenidodelatabla"/>
+              <w:bidi w:val="0"/>
+              <w:spacing w:before="0" w:after="120"/>
+              <w:jc w:val="left"/>
+              <w:rPr/>
+            </w:pPr>
+            <w:r>
+              <w:rPr/>
+              <w:t>Acción</w:t>
+            </w:r>
+          </w:p>
+        </w:tc>
+        <w:tc>
+          <w:tcPr>
+            <w:tcW w:w="8102" w:type="dxa"/>
+            <w:tcBorders/>
+            <w:vAlign w:val="center"/>
+          </w:tcPr>
+          <w:p>
+            <w:pPr>
+              <w:pStyle w:val="Contenidodelatabla"/>
+              <w:bidi w:val="0"/>
+              <w:spacing w:before="0" w:after="120"/>
+              <w:jc w:val="left"/>
+              <w:rPr/>
+            </w:pPr>
+            <w:r>
+              <w:rPr/>
+              <w:t>Botón "Entrar" alineado a la derecha</w:t>
+            </w:r>
+          </w:p>
+        </w:tc>
+      </w:tr>
+    </w:tbl>
+    <w:p>
+      <w:pPr>
+        <w:pStyle w:val="BodyText"/>
+        <w:bidi w:val="0"/>
+        <w:rPr/>
+      </w:pPr>
+      <w:r>
+        <w:rPr/>
+        <w:t>Mientras valida, una barra de progreso indeterminada corona la tarjeta.</w:t>
+      </w:r>
+    </w:p>
+    <w:p>
+      <w:pPr>
+        <w:pStyle w:val="BodyText"/>
+        <w:bidi w:val="0"/>
+        <w:rPr/>
+      </w:pPr>
       <w:r>
         <w:rPr>
           <w:rStyle w:val="Strong"/>
         </w:rPr>
-        <w:t>prioridad C</w:t>
-      </w:r>
-      <w:r>
-        <w:rPr/>
-        <w:t xml:space="preserve"> y PA-02 lo dejó tras el interruptor </w:t>
+        <w:t>Las tres líneas de la marca son la misma jerarquía que el menú lateral</w:t>
+      </w:r>
+      <w:r>
+        <w:rPr/>
+        <w:t xml:space="preserve"> (sección 3.3): icono, siglas, nombre completo. Allí van en fila y aquí apiladas y centradas, porque el </w:t>
       </w:r>
       <w:r>
         <w:rPr>
           <w:rStyle w:val="Textooriginal"/>
         </w:rPr>
-        <w:t>AUTH_ENABLED</w:t>
-      </w:r>
-      <w:r>
-        <w:rPr/>
-        <w:t xml:space="preserve">: con la seguridad desactivada la aplicación entra directa a </w:t>
+        <w:t>login</w:t>
+      </w:r>
+      <w:r>
+        <w:rPr/>
+        <w:t xml:space="preserve"> no tiene ancho que repartir y es la primera pantalla que alguien ve del sistema.</w:t>
+      </w:r>
+    </w:p>
+    <w:p>
+      <w:pPr>
+        <w:pStyle w:val="BodyText"/>
+        <w:bidi w:val="0"/>
+        <w:rPr/>
+      </w:pPr>
+      <w:r>
+        <w:rPr>
+          <w:rStyle w:val="Strong"/>
+        </w:rPr>
+        <w:t>El conmutador de la contraseña</w:t>
+      </w:r>
+      <w:r>
+        <w:rPr/>
+        <w:t xml:space="preserve"> es un botón de solo icono con rótulo accesible que alterna entre "Mostrar contraseña" y "Ocultar contraseña", lleva </w:t>
       </w:r>
       <w:r>
         <w:rPr>
           <w:rStyle w:val="Textooriginal"/>
         </w:rPr>
-        <w:t>/pages/dashboard</w:t>
-      </w:r>
-      <w:r>
-        <w:rPr/>
-        <w:t>, así que rehacer el acceso habría sido trabajo sobre una pantalla que nadie ve.</w:t>
+        <w:t>aria-pressed</w:t>
+      </w:r>
+      <w:r>
+        <w:rPr/>
+        <w:t xml:space="preserve"> y es </w:t>
+      </w:r>
+      <w:r>
+        <w:rPr>
+          <w:rStyle w:val="Textooriginal"/>
+        </w:rPr>
+        <w:t>type="button"</w:t>
+      </w:r>
+      <w:r>
+        <w:rPr/>
+        <w:t xml:space="preserve">: dentro de un </w:t>
+      </w:r>
+      <w:r>
+        <w:rPr>
+          <w:rStyle w:val="Textooriginal"/>
+        </w:rPr>
+        <w:t>&lt;form&gt;</w:t>
+      </w:r>
+      <w:r>
+        <w:rPr/>
+        <w:t xml:space="preserve">, un botón sin </w:t>
+      </w:r>
+      <w:r>
+        <w:rPr>
+          <w:rStyle w:val="Textooriginal"/>
+        </w:rPr>
+        <w:t>type</w:t>
+      </w:r>
+      <w:r>
+        <w:rPr/>
+        <w:t xml:space="preserve"> actúa como envío y mandaría el formulario al pulsarlo. La contraseña arranca </w:t>
+      </w:r>
+      <w:r>
+        <w:rPr>
+          <w:rStyle w:val="Strong"/>
+        </w:rPr>
+        <w:t>siempre oculta</w:t>
+      </w:r>
+      <w:r>
+        <w:rPr/>
+        <w:t>.</w:t>
+      </w:r>
+    </w:p>
+    <w:p>
+      <w:pPr>
+        <w:pStyle w:val="BodyText"/>
+        <w:bidi w:val="0"/>
+        <w:rPr/>
+      </w:pPr>
+      <w:r>
+        <w:rPr>
+          <w:rStyle w:val="Strong"/>
+        </w:rPr>
+        <w:t>Por qué el campo de correo lleva cuatro atributos y no uno.</w:t>
+      </w:r>
+      <w:r>
+        <w:rPr/>
+        <w:t xml:space="preserve"> </w:t>
+      </w:r>
+      <w:r>
+        <w:rPr>
+          <w:rStyle w:val="Textooriginal"/>
+        </w:rPr>
+        <w:t>type="email"</w:t>
+      </w:r>
+      <w:r>
+        <w:rPr/>
+        <w:t xml:space="preserve"> da el teclado con arroba y punto, pero es el conjunto el que apaga la autocorrección del móvil. En un campo de texto corriente, el teclado de Android "corrige" las palabras que no están en el diccionario y envía </w:t>
+      </w:r>
+      <w:r>
+        <w:rPr>
+          <w:rStyle w:val="Strong"/>
+        </w:rPr>
+        <w:t>otra dirección con formato válido</w:t>
+      </w:r>
+      <w:r>
+        <w:rPr/>
+        <w:t>: el validador la acepta, el botón se habilita y el backend responde 401. En el escritorio no ocurre porque no hay autocorrección, así que el fallo solo se ve desde un teléfono (DV-35 de AN090).</w:t>
       </w:r>
     </w:p>
     <w:p>
@@ -7590,6 +8221,24 @@
     </w:p>
     <w:p>
       <w:pPr>
+        <w:pStyle w:val="Citaenbloque"/>
+        <w:bidi w:val="0"/>
+        <w:jc w:val="left"/>
+        <w:rPr/>
+      </w:pPr>
+      <w:r>
+        <w:rPr>
+          <w:rStyle w:val="Strong"/>
+        </w:rPr>
+        <w:t>Ampliada el 2026-09-17</w:t>
+      </w:r>
+      <w:r>
+        <w:rPr/>
+        <w:t>: bloque de marca a tres líneas centradas, conmutador de visibilidad y saneamiento del campo de correo (DV-35 y DV-37 de AN090).</w:t>
+      </w:r>
+    </w:p>
+    <w:p>
+      <w:pPr>
         <w:pStyle w:val="Heading3"/>
         <w:bidi w:val="0"/>
         <w:jc w:val="left"/>
@@ -7796,7 +8445,135 @@
       </w:r>
       <w:r>
         <w:rPr/>
-        <w:t xml:space="preserve"> (avatar de 36 px, nombre, perfil y botón de salir).</w:t>
+        <w:t xml:space="preserve"> (avatar de 36 px, cuenta, perfil y botón de salir).</w:t>
+      </w:r>
+    </w:p>
+    <w:p>
+      <w:pPr>
+        <w:pStyle w:val="BodyText"/>
+        <w:bidi w:val="0"/>
+        <w:rPr/>
+      </w:pPr>
+      <w:r>
+        <w:rPr>
+          <w:rStyle w:val="Strong"/>
+        </w:rPr>
+        <w:t>La fila de usuario dice quién ha entrado.</w:t>
+      </w:r>
+      <w:r>
+        <w:rPr/>
+        <w:t xml:space="preserve"> Primera línea: la </w:t>
+      </w:r>
+      <w:r>
+        <w:rPr>
+          <w:rStyle w:val="Strong"/>
+        </w:rPr>
+        <w:t>cuenta</w:t>
+      </w:r>
+      <w:r>
+        <w:rPr/>
+        <w:t xml:space="preserve">, que es la parte del correo anterior a la arroba, recortada con puntos suspensivos y con el correo completo en el </w:t>
+      </w:r>
+      <w:r>
+        <w:rPr>
+          <w:rStyle w:val="Textooriginal"/>
+        </w:rPr>
+        <w:t>title</w:t>
+      </w:r>
+      <w:r>
+        <w:rPr/>
+        <w:t xml:space="preserve">. Segunda línea: el </w:t>
+      </w:r>
+      <w:r>
+        <w:rPr>
+          <w:rStyle w:val="Strong"/>
+        </w:rPr>
+        <w:t>perfil</w:t>
+      </w:r>
+      <w:r>
+        <w:rPr/>
+        <w:t xml:space="preserve">, "Bibliotecario". El dato sale de </w:t>
+      </w:r>
+      <w:r>
+        <w:rPr>
+          <w:rStyle w:val="Textooriginal"/>
+        </w:rPr>
+        <w:t>GET /auth/user</w:t>
+      </w:r>
+      <w:r>
+        <w:rPr/>
+        <w:t xml:space="preserve">, que devuelve el </w:t>
+      </w:r>
+      <w:r>
+        <w:rPr>
+          <w:rStyle w:val="Textooriginal"/>
+        </w:rPr>
+        <w:t>email</w:t>
+      </w:r>
+      <w:r>
+        <w:rPr/>
+        <w:t xml:space="preserve"> del token de Supabase.</w:t>
+      </w:r>
+    </w:p>
+    <w:p>
+      <w:pPr>
+        <w:pStyle w:val="BodyText"/>
+        <w:bidi w:val="0"/>
+        <w:rPr/>
+      </w:pPr>
+      <w:r>
+        <w:rPr/>
+        <w:t xml:space="preserve">Con </w:t>
+      </w:r>
+      <w:r>
+        <w:rPr>
+          <w:rStyle w:val="Textooriginal"/>
+        </w:rPr>
+        <w:t>AUTH_ENABLED</w:t>
+      </w:r>
+      <w:r>
+        <w:rPr/>
+        <w:t xml:space="preserve"> en </w:t>
+      </w:r>
+      <w:r>
+        <w:rPr>
+          <w:rStyle w:val="Textooriginal"/>
+        </w:rPr>
+        <w:t>false</w:t>
+      </w:r>
+      <w:r>
+        <w:rPr/>
+        <w:t xml:space="preserve"> </w:t>
+      </w:r>
+      <w:r>
+        <w:rPr>
+          <w:rStyle w:val="Strong"/>
+        </w:rPr>
+        <w:t>no se llama a ese endpoint</w:t>
+      </w:r>
+      <w:r>
+        <w:rPr/>
+        <w:t xml:space="preserve">: no hay sesión, la cadena de seguridad está en </w:t>
+      </w:r>
+      <w:r>
+        <w:rPr>
+          <w:rStyle w:val="Textooriginal"/>
+        </w:rPr>
+        <w:t>permitAll</w:t>
+      </w:r>
+      <w:r>
+        <w:rPr/>
+        <w:t xml:space="preserve"> y la respuesta sería </w:t>
+      </w:r>
+      <w:r>
+        <w:rPr>
+          <w:rStyle w:val="Textooriginal"/>
+        </w:rPr>
+        <w:t>anonymousUser</w:t>
+      </w:r>
+      <w:r>
+        <w:rPr/>
+        <w:t>, que no es un dato sino un artefacto. En ese caso la primera línea dice "Sin sesión" y se mantiene el perfil.</w:t>
       </w:r>
     </w:p>
     <w:p>
@@ -8518,10 +9295,10 @@
         </w:tblCellMar>
       </w:tblPr>
       <w:tblGrid>
-        <w:gridCol w:w="830"/>
-        <w:gridCol w:w="1869"/>
-        <w:gridCol w:w="2657"/>
-        <w:gridCol w:w="4056"/>
+        <w:gridCol w:w="787"/>
+        <w:gridCol w:w="1627"/>
+        <w:gridCol w:w="2197"/>
+        <w:gridCol w:w="4801"/>
       </w:tblGrid>
       <w:tr>
         <w:trPr>
@@ -8529,7 +9306,7 @@
         </w:trPr>
         <w:tc>
           <w:tcPr>
-            <w:tcW w:w="830" w:type="dxa"/>
+            <w:tcW w:w="787" w:type="dxa"/>
             <w:tcBorders/>
             <w:vAlign w:val="center"/>
           </w:tcPr>
@@ -8551,7 +9328,7 @@
         </w:tc>
         <w:tc>
           <w:tcPr>
-            <w:tcW w:w="1869" w:type="dxa"/>
+            <w:tcW w:w="1627" w:type="dxa"/>
             <w:tcBorders/>
             <w:vAlign w:val="center"/>
           </w:tcPr>
@@ -8573,7 +9350,7 @@
         </w:tc>
         <w:tc>
           <w:tcPr>
-            <w:tcW w:w="2657" w:type="dxa"/>
+            <w:tcW w:w="2197" w:type="dxa"/>
             <w:tcBorders/>
             <w:vAlign w:val="center"/>
           </w:tcPr>
@@ -8595,7 +9372,7 @@
         </w:tc>
         <w:tc>
           <w:tcPr>
-            <w:tcW w:w="4056" w:type="dxa"/>
+            <w:tcW w:w="4801" w:type="dxa"/>
             <w:tcBorders/>
             <w:vAlign w:val="center"/>
           </w:tcPr>
@@ -8620,7 +9397,7 @@
         <w:trPr/>
         <w:tc>
           <w:tcPr>
-            <w:tcW w:w="830" w:type="dxa"/>
+            <w:tcW w:w="787" w:type="dxa"/>
             <w:tcBorders/>
             <w:vAlign w:val="center"/>
           </w:tcPr>
@@ -8640,7 +9417,7 @@
         </w:tc>
         <w:tc>
           <w:tcPr>
-            <w:tcW w:w="1869" w:type="dxa"/>
+            <w:tcW w:w="1627" w:type="dxa"/>
             <w:tcBorders/>
             <w:vAlign w:val="center"/>
           </w:tcPr>
@@ -8660,7 +9437,7 @@
         </w:tc>
         <w:tc>
           <w:tcPr>
-            <w:tcW w:w="2657" w:type="dxa"/>
+            <w:tcW w:w="2197" w:type="dxa"/>
             <w:tcBorders/>
             <w:vAlign w:val="center"/>
           </w:tcPr>
@@ -8680,7 +9457,7 @@
         </w:tc>
         <w:tc>
           <w:tcPr>
-            <w:tcW w:w="4056" w:type="dxa"/>
+            <w:tcW w:w="4801" w:type="dxa"/>
             <w:tcBorders/>
             <w:vAlign w:val="center"/>
           </w:tcPr>
@@ -8703,7 +9480,7 @@
         <w:trPr/>
         <w:tc>
           <w:tcPr>
-            <w:tcW w:w="830" w:type="dxa"/>
+            <w:tcW w:w="787" w:type="dxa"/>
             <w:tcBorders/>
             <w:vAlign w:val="center"/>
           </w:tcPr>
@@ -8723,7 +9500,7 @@
         </w:tc>
         <w:tc>
           <w:tcPr>
-            <w:tcW w:w="1869" w:type="dxa"/>
+            <w:tcW w:w="1627" w:type="dxa"/>
             <w:tcBorders/>
             <w:vAlign w:val="center"/>
           </w:tcPr>
@@ -8743,7 +9520,7 @@
         </w:tc>
         <w:tc>
           <w:tcPr>
-            <w:tcW w:w="2657" w:type="dxa"/>
+            <w:tcW w:w="2197" w:type="dxa"/>
             <w:tcBorders/>
             <w:vAlign w:val="center"/>
           </w:tcPr>
@@ -8763,21 +9540,27 @@
         </w:tc>
         <w:tc>
           <w:tcPr>
-            <w:tcW w:w="4056" w:type="dxa"/>
-            <w:tcBorders/>
-            <w:vAlign w:val="center"/>
-          </w:tcPr>
-          <w:p>
-            <w:pPr>
-              <w:pStyle w:val="Contenidodelatabla"/>
-              <w:bidi w:val="0"/>
-              <w:spacing w:before="0" w:after="120"/>
-              <w:jc w:val="left"/>
-              <w:rPr/>
-            </w:pPr>
-            <w:r>
-              <w:rPr/>
-              <w:t>Título compacto de 24/30 y acción principal como botón flotante</w:t>
+            <w:tcW w:w="4801" w:type="dxa"/>
+            <w:tcBorders/>
+            <w:vAlign w:val="center"/>
+          </w:tcPr>
+          <w:p>
+            <w:pPr>
+              <w:pStyle w:val="Contenidodelatabla"/>
+              <w:bidi w:val="0"/>
+              <w:spacing w:before="0" w:after="120"/>
+              <w:jc w:val="left"/>
+              <w:rPr/>
+            </w:pPr>
+            <w:r>
+              <w:rPr/>
+              <w:t xml:space="preserve">Título compacto de 24/30, acción principal como botón flotante y </w:t>
+            </w:r>
+            <w:r>
+              <w:rPr>
+                <w:rStyle w:val="Strong"/>
+              </w:rPr>
+              <w:t>avatar de cuenta a la derecha</w:t>
             </w:r>
           </w:p>
         </w:tc>
@@ -8802,33 +9585,6 @@
       <w:r>
         <w:rPr/>
         <w:t xml:space="preserve"> (390 x 844) fija la variante estrecha, que es la que cumple RNF-07 y TW-11. Dos decisiones importantes:</w:t>
-      </w:r>
-    </w:p>
-    <w:p>
-      <w:pPr>
-        <w:pStyle w:val="BodyText"/>
-        <w:numPr>
-          <w:ilvl w:val="0"/>
-          <w:numId w:val="2"/>
-        </w:numPr>
-        <w:tabs>
-          <w:tab w:val="clear" w:pos="1134"/>
-          <w:tab w:val="left" w:pos="709" w:leader="none"/>
-        </w:tabs>
-        <w:bidi w:val="0"/>
-        <w:spacing w:before="0" w:after="0"/>
-        <w:ind w:hanging="283" w:left="709"/>
-        <w:rPr/>
-      </w:pPr>
-      <w:r>
-        <w:rPr>
-          <w:rStyle w:val="Strong"/>
-        </w:rPr>
-        <w:t>La tabla desaparece, no se encoge.</w:t>
-      </w:r>
-      <w:r>
-        <w:rPr/>
-        <w:t xml:space="preserve"> A 390 px cada libro es una tarjeta con título, autor, chip de categoría y etiqueta de disponibilidad. Comprimir seis columnas produce una tabla ilegible con desbordamiento horizontal, que es exactamente lo que RNF-07 prohíbe. </w:t>
       </w:r>
     </w:p>
     <w:p>
@@ -8850,6 +9606,32 @@
         <w:rPr>
           <w:rStyle w:val="Strong"/>
         </w:rPr>
+        <w:t>La tabla desaparece, no se encoge.</w:t>
+      </w:r>
+      <w:r>
+        <w:rPr/>
+        <w:t xml:space="preserve"> A 390 px cada libro es una tarjeta con título, autor, chip de categoría y etiqueta de disponibilidad. Comprimir seis columnas produce una tabla ilegible con desbordamiento horizontal, que es exactamente lo que RNF-07 prohíbe.</w:t>
+      </w:r>
+    </w:p>
+    <w:p>
+      <w:pPr>
+        <w:pStyle w:val="BodyText"/>
+        <w:numPr>
+          <w:ilvl w:val="0"/>
+          <w:numId w:val="2"/>
+        </w:numPr>
+        <w:tabs>
+          <w:tab w:val="clear" w:pos="1134"/>
+          <w:tab w:val="left" w:pos="709" w:leader="none"/>
+        </w:tabs>
+        <w:bidi w:val="0"/>
+        <w:ind w:hanging="283" w:left="709"/>
+        <w:rPr/>
+      </w:pPr>
+      <w:r>
+        <w:rPr>
+          <w:rStyle w:val="Strong"/>
+        </w:rPr>
         <w:t>La barra inferior lleva cinco destinos, no seis.</w:t>
       </w:r>
       <w:r>
@@ -8864,7 +9646,174 @@
       </w:r>
       <w:r>
         <w:rPr/>
-        <w:t xml:space="preserve"> se relega al menú de la propia pantalla de Libros. Es el mantenimiento menos frecuente. </w:t>
+        <w:t xml:space="preserve"> se relega al menú de la propia pantalla de Libros. Es el mantenimiento menos frecuente.</w:t>
+      </w:r>
+    </w:p>
+    <w:p>
+      <w:pPr>
+        <w:pStyle w:val="BodyText"/>
+        <w:numPr>
+          <w:ilvl w:val="0"/>
+          <w:numId w:val="2"/>
+        </w:numPr>
+        <w:tabs>
+          <w:tab w:val="clear" w:pos="1134"/>
+          <w:tab w:val="left" w:pos="709" w:leader="none"/>
+        </w:tabs>
+        <w:bidi w:val="0"/>
+        <w:ind w:hanging="283" w:left="709"/>
+        <w:rPr/>
+      </w:pPr>
+      <w:r>
+        <w:rPr>
+          <w:rStyle w:val="Strong"/>
+        </w:rPr>
+        <w:t>La cuenta y la salida viven en la cabecera, no en la barra.</w:t>
+      </w:r>
+      <w:r>
+        <w:rPr/>
+        <w:t xml:space="preserve"> Por debajo de 1024 px el menú lateral desaparece, y con él la fila de usuario y el único botón de cerrar sesión: en un teléfono no había forma de salir ni de saber con qué cuenta se había entrado. Se resuelve con un </w:t>
+      </w:r>
+      <w:r>
+        <w:rPr>
+          <w:rStyle w:val="Strong"/>
+        </w:rPr>
+        <w:t>avatar de 36 px al final de la cabecera</w:t>
+      </w:r>
+      <w:r>
+        <w:rPr/>
+        <w:t xml:space="preserve"> que abre un menú con el correo completo y "Cerrar sesión". No se añade un sexto destino a la barra: rompería la regla anterior y dejaría los objetivos táctiles en 65 px. El avatar </w:t>
+      </w:r>
+      <w:r>
+        <w:rPr>
+          <w:rStyle w:val="Strong"/>
+        </w:rPr>
+        <w:t>solo existe por debajo de 1024 px</w:t>
+      </w:r>
+      <w:r>
+        <w:rPr/>
+        <w:t>; por encima, la fila del menú lateral ya hace ese trabajo (DV-38).</w:t>
+      </w:r>
+    </w:p>
+    <w:p>
+      <w:pPr>
+        <w:pStyle w:val="BodyText"/>
+        <w:bidi w:val="0"/>
+        <w:rPr/>
+      </w:pPr>
+      <w:r>
+        <w:rPr>
+          <w:rStyle w:val="Strong"/>
+        </w:rPr>
+        <w:t xml:space="preserve">El alto del shell se mide en </w:t>
+      </w:r>
+      <w:r>
+        <w:rPr>
+          <w:rStyle w:val="Textooriginal"/>
+        </w:rPr>
+        <w:t>dvh</w:t>
+      </w:r>
+      <w:r>
+        <w:rPr>
+          <w:rStyle w:val="Strong"/>
+        </w:rPr>
+        <w:t xml:space="preserve">, no en </w:t>
+      </w:r>
+      <w:r>
+        <w:rPr>
+          <w:rStyle w:val="Textooriginal"/>
+        </w:rPr>
+        <w:t>vh</w:t>
+      </w:r>
+      <w:r>
+        <w:rPr>
+          <w:rStyle w:val="Strong"/>
+        </w:rPr>
+        <w:t>.</w:t>
+      </w:r>
+      <w:r>
+        <w:rPr/>
+        <w:t xml:space="preserve"> En el navegador de un teléfono, </w:t>
+      </w:r>
+      <w:r>
+        <w:rPr>
+          <w:rStyle w:val="Textooriginal"/>
+        </w:rPr>
+        <w:t>100vh</w:t>
+      </w:r>
+      <w:r>
+        <w:rPr/>
+        <w:t xml:space="preserve"> es la altura de la ventana </w:t>
+      </w:r>
+      <w:r>
+        <w:rPr>
+          <w:rStyle w:val="Emphasis"/>
+        </w:rPr>
+        <w:t>con la barra de direcciones retraída</w:t>
+      </w:r>
+      <w:r>
+        <w:rPr/>
+        <w:t xml:space="preserve">, que es mayor que lo visible mientras esa barra se ve. Un shell de </w:t>
+      </w:r>
+      <w:r>
+        <w:rPr>
+          <w:rStyle w:val="Textooriginal"/>
+        </w:rPr>
+        <w:t>100vh</w:t>
+      </w:r>
+      <w:r>
+        <w:rPr/>
+        <w:t xml:space="preserve"> desborda por abajo, el documento entero pasa a desplazarse y </w:t>
+      </w:r>
+      <w:r>
+        <w:rPr>
+          <w:rStyle w:val="Strong"/>
+        </w:rPr>
+        <w:t>la barra inferior queda bajo el pliegue</w:t>
+      </w:r>
+      <w:r>
+        <w:rPr/>
+        <w:t xml:space="preserve">, moviéndose con el dedo en vez de quedarse quieta. El botón flotante no comparte el fallo porque es </w:t>
+      </w:r>
+      <w:r>
+        <w:rPr>
+          <w:rStyle w:val="Textooriginal"/>
+        </w:rPr>
+        <w:t>position: fixed</w:t>
+      </w:r>
+      <w:r>
+        <w:rPr/>
+        <w:t xml:space="preserve"> y se ancla al viewport real, así que los dos se contradicen en pantalla. </w:t>
+      </w:r>
+      <w:r>
+        <w:rPr>
+          <w:rStyle w:val="Textooriginal"/>
+        </w:rPr>
+        <w:t>100dvh</w:t>
+      </w:r>
+      <w:r>
+        <w:rPr/>
+        <w:t xml:space="preserve"> sigue el área visible y deja fija la barra. Se declara </w:t>
+      </w:r>
+      <w:r>
+        <w:rPr>
+          <w:rStyle w:val="Textooriginal"/>
+        </w:rPr>
+        <w:t>100vh</w:t>
+      </w:r>
+      <w:r>
+        <w:rPr/>
+        <w:t xml:space="preserve"> antes como reserva para navegadores sin </w:t>
+      </w:r>
+      <w:r>
+        <w:rPr>
+          <w:rStyle w:val="Textooriginal"/>
+        </w:rPr>
+        <w:t>dvh</w:t>
+      </w:r>
+      <w:r>
+        <w:rPr/>
+        <w:t xml:space="preserve"> (DV-36).</w:t>
       </w:r>
     </w:p>
     <w:p>
@@ -10417,9 +11366,9 @@
         </w:tblCellMar>
       </w:tblPr>
       <w:tblGrid>
-        <w:gridCol w:w="2514"/>
-        <w:gridCol w:w="4007"/>
-        <w:gridCol w:w="2891"/>
+        <w:gridCol w:w="2051"/>
+        <w:gridCol w:w="4977"/>
+        <w:gridCol w:w="2384"/>
       </w:tblGrid>
       <w:tr>
         <w:trPr>
@@ -10427,7 +11376,7 @@
         </w:trPr>
         <w:tc>
           <w:tcPr>
-            <w:tcW w:w="2514" w:type="dxa"/>
+            <w:tcW w:w="2051" w:type="dxa"/>
             <w:tcBorders/>
             <w:vAlign w:val="center"/>
           </w:tcPr>
@@ -10449,7 +11398,7 @@
         </w:tc>
         <w:tc>
           <w:tcPr>
-            <w:tcW w:w="4007" w:type="dxa"/>
+            <w:tcW w:w="4977" w:type="dxa"/>
             <w:tcBorders/>
             <w:vAlign w:val="center"/>
           </w:tcPr>
@@ -10471,7 +11420,7 @@
         </w:tc>
         <w:tc>
           <w:tcPr>
-            <w:tcW w:w="2891" w:type="dxa"/>
+            <w:tcW w:w="2384" w:type="dxa"/>
             <w:tcBorders/>
             <w:vAlign w:val="center"/>
           </w:tcPr>
@@ -10496,7 +11445,7 @@
         <w:trPr/>
         <w:tc>
           <w:tcPr>
-            <w:tcW w:w="2514" w:type="dxa"/>
+            <w:tcW w:w="2051" w:type="dxa"/>
             <w:tcBorders/>
             <w:vAlign w:val="center"/>
           </w:tcPr>
@@ -10516,7 +11465,7 @@
         </w:tc>
         <w:tc>
           <w:tcPr>
-            <w:tcW w:w="4007" w:type="dxa"/>
+            <w:tcW w:w="4977" w:type="dxa"/>
             <w:tcBorders/>
             <w:vAlign w:val="center"/>
           </w:tcPr>
@@ -10536,7 +11485,7 @@
         </w:tc>
         <w:tc>
           <w:tcPr>
-            <w:tcW w:w="2891" w:type="dxa"/>
+            <w:tcW w:w="2384" w:type="dxa"/>
             <w:tcBorders/>
             <w:vAlign w:val="center"/>
           </w:tcPr>
@@ -10559,7 +11508,7 @@
         <w:trPr/>
         <w:tc>
           <w:tcPr>
-            <w:tcW w:w="2514" w:type="dxa"/>
+            <w:tcW w:w="2051" w:type="dxa"/>
             <w:tcBorders/>
             <w:vAlign w:val="center"/>
           </w:tcPr>
@@ -10579,7 +11528,7 @@
         </w:tc>
         <w:tc>
           <w:tcPr>
-            <w:tcW w:w="4007" w:type="dxa"/>
+            <w:tcW w:w="4977" w:type="dxa"/>
             <w:tcBorders/>
             <w:vAlign w:val="center"/>
           </w:tcPr>
@@ -10599,7 +11548,7 @@
         </w:tc>
         <w:tc>
           <w:tcPr>
-            <w:tcW w:w="2891" w:type="dxa"/>
+            <w:tcW w:w="2384" w:type="dxa"/>
             <w:tcBorders/>
             <w:vAlign w:val="center"/>
           </w:tcPr>
@@ -10622,7 +11571,7 @@
         <w:trPr/>
         <w:tc>
           <w:tcPr>
-            <w:tcW w:w="2514" w:type="dxa"/>
+            <w:tcW w:w="2051" w:type="dxa"/>
             <w:tcBorders/>
             <w:vAlign w:val="center"/>
           </w:tcPr>
@@ -10642,7 +11591,7 @@
         </w:tc>
         <w:tc>
           <w:tcPr>
-            <w:tcW w:w="4007" w:type="dxa"/>
+            <w:tcW w:w="4977" w:type="dxa"/>
             <w:tcBorders/>
             <w:vAlign w:val="center"/>
           </w:tcPr>
@@ -10662,7 +11611,7 @@
         </w:tc>
         <w:tc>
           <w:tcPr>
-            <w:tcW w:w="2891" w:type="dxa"/>
+            <w:tcW w:w="2384" w:type="dxa"/>
             <w:tcBorders/>
             <w:vAlign w:val="center"/>
           </w:tcPr>
@@ -10685,7 +11634,7 @@
         <w:trPr/>
         <w:tc>
           <w:tcPr>
-            <w:tcW w:w="2514" w:type="dxa"/>
+            <w:tcW w:w="2051" w:type="dxa"/>
             <w:tcBorders/>
             <w:vAlign w:val="center"/>
           </w:tcPr>
@@ -10705,7 +11654,7 @@
         </w:tc>
         <w:tc>
           <w:tcPr>
-            <w:tcW w:w="4007" w:type="dxa"/>
+            <w:tcW w:w="4977" w:type="dxa"/>
             <w:tcBorders/>
             <w:vAlign w:val="center"/>
           </w:tcPr>
@@ -10735,7 +11684,7 @@
         </w:tc>
         <w:tc>
           <w:tcPr>
-            <w:tcW w:w="2891" w:type="dxa"/>
+            <w:tcW w:w="2384" w:type="dxa"/>
             <w:tcBorders/>
             <w:vAlign w:val="center"/>
           </w:tcPr>
@@ -10758,7 +11707,7 @@
         <w:trPr/>
         <w:tc>
           <w:tcPr>
-            <w:tcW w:w="2514" w:type="dxa"/>
+            <w:tcW w:w="2051" w:type="dxa"/>
             <w:tcBorders/>
             <w:vAlign w:val="center"/>
           </w:tcPr>
@@ -10778,7 +11727,7 @@
         </w:tc>
         <w:tc>
           <w:tcPr>
-            <w:tcW w:w="4007" w:type="dxa"/>
+            <w:tcW w:w="4977" w:type="dxa"/>
             <w:tcBorders/>
             <w:vAlign w:val="center"/>
           </w:tcPr>
@@ -10798,7 +11747,7 @@
         </w:tc>
         <w:tc>
           <w:tcPr>
-            <w:tcW w:w="2891" w:type="dxa"/>
+            <w:tcW w:w="2384" w:type="dxa"/>
             <w:tcBorders/>
             <w:vAlign w:val="center"/>
           </w:tcPr>
@@ -10827,7 +11776,7 @@
         <w:trPr/>
         <w:tc>
           <w:tcPr>
-            <w:tcW w:w="2514" w:type="dxa"/>
+            <w:tcW w:w="2051" w:type="dxa"/>
             <w:tcBorders/>
             <w:vAlign w:val="center"/>
           </w:tcPr>
@@ -10847,7 +11796,7 @@
         </w:tc>
         <w:tc>
           <w:tcPr>
-            <w:tcW w:w="4007" w:type="dxa"/>
+            <w:tcW w:w="4977" w:type="dxa"/>
             <w:tcBorders/>
             <w:vAlign w:val="center"/>
           </w:tcPr>
@@ -10867,7 +11816,7 @@
         </w:tc>
         <w:tc>
           <w:tcPr>
-            <w:tcW w:w="2891" w:type="dxa"/>
+            <w:tcW w:w="2384" w:type="dxa"/>
             <w:tcBorders/>
             <w:vAlign w:val="center"/>
           </w:tcPr>
@@ -10890,7 +11839,7 @@
         <w:trPr/>
         <w:tc>
           <w:tcPr>
-            <w:tcW w:w="2514" w:type="dxa"/>
+            <w:tcW w:w="2051" w:type="dxa"/>
             <w:tcBorders/>
             <w:vAlign w:val="center"/>
           </w:tcPr>
@@ -10910,7 +11859,7 @@
         </w:tc>
         <w:tc>
           <w:tcPr>
-            <w:tcW w:w="4007" w:type="dxa"/>
+            <w:tcW w:w="4977" w:type="dxa"/>
             <w:tcBorders/>
             <w:vAlign w:val="center"/>
           </w:tcPr>
@@ -10930,7 +11879,7 @@
         </w:tc>
         <w:tc>
           <w:tcPr>
-            <w:tcW w:w="2891" w:type="dxa"/>
+            <w:tcW w:w="2384" w:type="dxa"/>
             <w:tcBorders/>
             <w:vAlign w:val="center"/>
           </w:tcPr>
@@ -10951,6 +11900,158 @@
             <w:r>
               <w:rPr/>
               <w:t xml:space="preserve"> (RNF-07, TW-11)</w:t>
+            </w:r>
+          </w:p>
+        </w:tc>
+      </w:tr>
+      <w:tr>
+        <w:trPr/>
+        <w:tc>
+          <w:tcPr>
+            <w:tcW w:w="2051" w:type="dxa"/>
+            <w:tcBorders/>
+            <w:vAlign w:val="center"/>
+          </w:tcPr>
+          <w:p>
+            <w:pPr>
+              <w:pStyle w:val="Contenidodelatabla"/>
+              <w:bidi w:val="0"/>
+              <w:spacing w:before="0" w:after="120"/>
+              <w:jc w:val="left"/>
+              <w:rPr/>
+            </w:pPr>
+            <w:r>
+              <w:rPr/>
+              <w:t>Control de dos estados</w:t>
+            </w:r>
+          </w:p>
+        </w:tc>
+        <w:tc>
+          <w:tcPr>
+            <w:tcW w:w="4977" w:type="dxa"/>
+            <w:tcBorders/>
+            <w:vAlign w:val="center"/>
+          </w:tcPr>
+          <w:p>
+            <w:pPr>
+              <w:pStyle w:val="Contenidodelatabla"/>
+              <w:bidi w:val="0"/>
+              <w:spacing w:before="0" w:after="120"/>
+              <w:jc w:val="left"/>
+              <w:rPr/>
+            </w:pPr>
+            <w:r>
+              <w:rPr/>
+              <w:t xml:space="preserve">Lleva </w:t>
+            </w:r>
+            <w:r>
+              <w:rPr>
+                <w:rStyle w:val="Textooriginal"/>
+              </w:rPr>
+              <w:t>aria-pressed</w:t>
+            </w:r>
+            <w:r>
+              <w:rPr/>
+              <w:t xml:space="preserve"> y su rótulo dice la acción, no el estado</w:t>
+            </w:r>
+          </w:p>
+        </w:tc>
+        <w:tc>
+          <w:tcPr>
+            <w:tcW w:w="2384" w:type="dxa"/>
+            <w:tcBorders/>
+            <w:vAlign w:val="center"/>
+          </w:tcPr>
+          <w:p>
+            <w:pPr>
+              <w:pStyle w:val="Contenidodelatabla"/>
+              <w:bidi w:val="0"/>
+              <w:spacing w:before="0" w:after="120"/>
+              <w:jc w:val="left"/>
+              <w:rPr/>
+            </w:pPr>
+            <w:r>
+              <w:rPr/>
+              <w:t>Conmutador de contraseña</w:t>
+            </w:r>
+          </w:p>
+        </w:tc>
+      </w:tr>
+      <w:tr>
+        <w:trPr/>
+        <w:tc>
+          <w:tcPr>
+            <w:tcW w:w="2051" w:type="dxa"/>
+            <w:tcBorders/>
+            <w:vAlign w:val="center"/>
+          </w:tcPr>
+          <w:p>
+            <w:pPr>
+              <w:pStyle w:val="Contenidodelatabla"/>
+              <w:bidi w:val="0"/>
+              <w:spacing w:before="0" w:after="120"/>
+              <w:jc w:val="left"/>
+              <w:rPr/>
+            </w:pPr>
+            <w:r>
+              <w:rPr/>
+              <w:t>Alto de ventana</w:t>
+            </w:r>
+          </w:p>
+        </w:tc>
+        <w:tc>
+          <w:tcPr>
+            <w:tcW w:w="4977" w:type="dxa"/>
+            <w:tcBorders/>
+            <w:vAlign w:val="center"/>
+          </w:tcPr>
+          <w:p>
+            <w:pPr>
+              <w:pStyle w:val="Contenidodelatabla"/>
+              <w:bidi w:val="0"/>
+              <w:spacing w:before="0" w:after="120"/>
+              <w:jc w:val="left"/>
+              <w:rPr/>
+            </w:pPr>
+            <w:r>
+              <w:rPr/>
+              <w:t xml:space="preserve">El shell se mide en </w:t>
+            </w:r>
+            <w:r>
+              <w:rPr>
+                <w:rStyle w:val="Textooriginal"/>
+              </w:rPr>
+              <w:t>dvh</w:t>
+            </w:r>
+            <w:r>
+              <w:rPr/>
+              <w:t xml:space="preserve">; nada que deba quedar fijo va en el flujo de un alto en </w:t>
+            </w:r>
+            <w:r>
+              <w:rPr>
+                <w:rStyle w:val="Textooriginal"/>
+              </w:rPr>
+              <w:t>vh</w:t>
+            </w:r>
+          </w:p>
+        </w:tc>
+        <w:tc>
+          <w:tcPr>
+            <w:tcW w:w="2384" w:type="dxa"/>
+            <w:tcBorders/>
+            <w:vAlign w:val="center"/>
+          </w:tcPr>
+          <w:p>
+            <w:pPr>
+              <w:pStyle w:val="Contenidodelatabla"/>
+              <w:bidi w:val="0"/>
+              <w:spacing w:before="0" w:after="120"/>
+              <w:jc w:val="left"/>
+              <w:rPr/>
+            </w:pPr>
+            <w:r>
+              <w:rPr/>
+              <w:t>Sección 3.5</w:t>
             </w:r>
           </w:p>
         </w:tc>

</xml_diff>

<commit_message>
Nombre del sistema del login a la escala tipografica (DV-39)
</commit_message>
<xml_diff>
--- a/documentacion/AN050-diseño-ui-ux.docx
+++ b/documentacion/AN050-diseño-ui-ux.docx
@@ -255,7 +255,7 @@
             </w:pPr>
             <w:r>
               <w:rPr/>
-              <w:t>1.3</w:t>
+              <w:t>1.4</w:t>
             </w:r>
           </w:p>
         </w:tc>
@@ -1010,6 +1010,119 @@
           </w:p>
         </w:tc>
       </w:tr>
+      <w:tr>
+        <w:trPr/>
+        <w:tc>
+          <w:tcPr>
+            <w:tcW w:w="995" w:type="dxa"/>
+            <w:tcBorders/>
+            <w:vAlign w:val="center"/>
+          </w:tcPr>
+          <w:p>
+            <w:pPr>
+              <w:pStyle w:val="Contenidodelatabla"/>
+              <w:bidi w:val="0"/>
+              <w:spacing w:before="0" w:after="120"/>
+              <w:jc w:val="left"/>
+              <w:rPr/>
+            </w:pPr>
+            <w:r>
+              <w:rPr/>
+              <w:t>1.4</w:t>
+            </w:r>
+          </w:p>
+        </w:tc>
+        <w:tc>
+          <w:tcPr>
+            <w:tcW w:w="1310" w:type="dxa"/>
+            <w:tcBorders/>
+            <w:vAlign w:val="center"/>
+          </w:tcPr>
+          <w:p>
+            <w:pPr>
+              <w:pStyle w:val="Contenidodelatabla"/>
+              <w:bidi w:val="0"/>
+              <w:spacing w:before="0" w:after="120"/>
+              <w:jc w:val="left"/>
+              <w:rPr/>
+            </w:pPr>
+            <w:r>
+              <w:rPr/>
+              <w:t>2026-09-17</w:t>
+            </w:r>
+          </w:p>
+        </w:tc>
+        <w:tc>
+          <w:tcPr>
+            <w:tcW w:w="890" w:type="dxa"/>
+            <w:tcBorders/>
+            <w:vAlign w:val="center"/>
+          </w:tcPr>
+          <w:p>
+            <w:pPr>
+              <w:pStyle w:val="Contenidodelatabla"/>
+              <w:bidi w:val="0"/>
+              <w:spacing w:before="0" w:after="120"/>
+              <w:jc w:val="left"/>
+              <w:rPr/>
+            </w:pPr>
+            <w:r>
+              <w:rPr/>
+              <w:t>D. Quispe</w:t>
+            </w:r>
+          </w:p>
+        </w:tc>
+        <w:tc>
+          <w:tcPr>
+            <w:tcW w:w="6217" w:type="dxa"/>
+            <w:tcBorders/>
+            <w:vAlign w:val="center"/>
+          </w:tcPr>
+          <w:p>
+            <w:pPr>
+              <w:pStyle w:val="Contenidodelatabla"/>
+              <w:bidi w:val="0"/>
+              <w:spacing w:before="0" w:after="120"/>
+              <w:jc w:val="left"/>
+              <w:rPr/>
+            </w:pPr>
+            <w:r>
+              <w:rPr/>
+              <w:t xml:space="preserve">El nombre del sistema en el </w:t>
+            </w:r>
+            <w:r>
+              <w:rPr>
+                <w:rStyle w:val="Textooriginal"/>
+              </w:rPr>
+              <w:t>login</w:t>
+            </w:r>
+            <w:r>
+              <w:rPr/>
+              <w:t xml:space="preserve"> se veía pequeño en el teléfono: llevaba 12 px, un tamaño que la escala de sección 2.5 no tiene. Pasa a </w:t>
+            </w:r>
+            <w:r>
+              <w:rPr>
+                <w:rStyle w:val="Textooriginal"/>
+              </w:rPr>
+              <w:t>Label large</w:t>
+            </w:r>
+            <w:r>
+              <w:rPr/>
+              <w:t xml:space="preserve"> (14/20), medido para que siga en una línea a 360 px. Sección 2.5 publica además la </w:t>
+            </w:r>
+            <w:r>
+              <w:rPr>
+                <w:rStyle w:val="Strong"/>
+              </w:rPr>
+              <w:t>escala menor</w:t>
+            </w:r>
+            <w:r>
+              <w:rPr/>
+              <w:t xml:space="preserve"> -21, 13, 11 y 24- que las secciones 3.3 y 3.5 venían mandando sin que la tabla la recogiera, y fija la regla de que el contenido nunca baja de 14 (DV-39 de AN090).</w:t>
+            </w:r>
+          </w:p>
+        </w:tc>
+      </w:tr>
     </w:tbl>
     <w:p>
       <w:pPr>
@@ -7295,336 +7408,11 @@
         <w:rPr>
           <w:rStyle w:val="Strong"/>
         </w:rPr>
-        <w:t>Fuentes verificadas.</w:t>
-      </w:r>
-      <w:r>
-        <w:rPr/>
-        <w:t xml:space="preserve"> Las tres cargaron en Figma sin caer al sustituto Inter. El generador tiene un mecanismo de reserva a Inter y avisa de la familia que faltó, para que un render con la tipografía equivocada no pase por bueno.</w:t>
-      </w:r>
-    </w:p>
-    <w:p>
-      <w:pPr>
-        <w:pStyle w:val="BodyText"/>
-        <w:bidi w:val="0"/>
-        <w:rPr/>
-      </w:pPr>
-      <w:r>
-        <w:rPr>
-          <w:rStyle w:val="Strong"/>
-        </w:rPr>
-        <w:t>Iconografía:</w:t>
-      </w:r>
-      <w:r>
-        <w:rPr/>
-        <w:t xml:space="preserve"> trazo de 20 px en el menú y 18 px en los controles, con el peso del icono alineado al texto que acompaña. Ningún icono va solo si es la única forma de entender la acción: los botones de fila (editar, eliminar) llevan rótulo accesible.</w:t>
-      </w:r>
-    </w:p>
-    <w:p>
-      <w:pPr>
-        <w:pStyle w:val="Lneahorizontal"/>
-        <w:bidi w:val="0"/>
-        <w:jc w:val="left"/>
-        <w:rPr/>
-      </w:pPr>
-      <w:r>
-        <w:rPr/>
-      </w:r>
-    </w:p>
-    <w:p>
-      <w:pPr>
-        <w:pStyle w:val="Heading2"/>
-        <w:bidi w:val="0"/>
-        <w:rPr/>
-      </w:pPr>
-      <w:r>
-        <w:rPr/>
-        <w:t>3. Estructura de la aplicación (app shell)</w:t>
-      </w:r>
-    </w:p>
-    <w:p>
-      <w:pPr>
-        <w:pStyle w:val="BodyText"/>
-        <w:bidi w:val="0"/>
-        <w:rPr/>
-      </w:pPr>
-      <w:r>
-        <w:rPr/>
-        <w:t xml:space="preserve">Lienzo de escritorio: </w:t>
-      </w:r>
-      <w:r>
-        <w:rPr>
-          <w:rStyle w:val="Strong"/>
-        </w:rPr>
-        <w:t>1440 x 900</w:t>
-      </w:r>
-      <w:r>
-        <w:rPr/>
-        <w:t>. Dos zonas fijas - menú lateral de 248 px y columna de contenido de 1192 px.</w:t>
-      </w:r>
-    </w:p>
-    <w:p>
-      <w:pPr>
-        <w:pStyle w:val="Textopreformateado"/>
-        <w:bidi w:val="0"/>
-        <w:jc w:val="left"/>
-        <w:rPr/>
-      </w:pPr>
-      <w:r>
-        <w:rPr>
-          <w:rStyle w:val="Textooriginal"/>
-        </w:rPr>
-        <w:t>+------------+--------------------------------------------------+</w:t>
-      </w:r>
-    </w:p>
-    <w:p>
-      <w:pPr>
-        <w:pStyle w:val="Textopreformateado"/>
-        <w:bidi w:val="0"/>
-        <w:jc w:val="left"/>
-        <w:rPr/>
-      </w:pPr>
-      <w:r>
-        <w:rPr>
-          <w:rStyle w:val="Textooriginal"/>
-        </w:rPr>
-        <w:t>|  sidenav   |  topbar  80 px                                   |</w:t>
-      </w:r>
-    </w:p>
-    <w:p>
-      <w:pPr>
-        <w:pStyle w:val="Textopreformateado"/>
-        <w:bidi w:val="0"/>
-        <w:jc w:val="left"/>
-        <w:rPr/>
-      </w:pPr>
-      <w:r>
-        <w:rPr>
-          <w:rStyle w:val="Textooriginal"/>
-        </w:rPr>
-        <w:t>|  248 px    |  Título (Lora 28) + subtítulo - acciones a la dcha|</w:t>
-      </w:r>
-    </w:p>
-    <w:p>
-      <w:pPr>
-        <w:pStyle w:val="Textopreformateado"/>
-        <w:bidi w:val="0"/>
-        <w:jc w:val="left"/>
-        <w:rPr/>
-      </w:pPr>
-      <w:r>
-        <w:rPr>
-          <w:rStyle w:val="Textooriginal"/>
-        </w:rPr>
-        <w:t>|            +--------------------------------------------------+</w:t>
-      </w:r>
-    </w:p>
-    <w:p>
-      <w:pPr>
-        <w:pStyle w:val="Textopreformateado"/>
-        <w:bidi w:val="0"/>
-        <w:jc w:val="left"/>
-        <w:rPr/>
-      </w:pPr>
-      <w:r>
-        <w:rPr>
-          <w:rStyle w:val="Textooriginal"/>
-        </w:rPr>
-        <w:t>|  marca     |                                                  |</w:t>
-      </w:r>
-    </w:p>
-    <w:p>
-      <w:pPr>
-        <w:pStyle w:val="Textopreformateado"/>
-        <w:bidi w:val="0"/>
-        <w:jc w:val="left"/>
-        <w:rPr/>
-      </w:pPr>
-      <w:r>
-        <w:rPr>
-          <w:rStyle w:val="Textooriginal"/>
-        </w:rPr>
-        <w:t>|  -------   |  body   padding 32 px - gap 20 px                |</w:t>
-      </w:r>
-    </w:p>
-    <w:p>
-      <w:pPr>
-        <w:pStyle w:val="Textopreformateado"/>
-        <w:bidi w:val="0"/>
-        <w:jc w:val="left"/>
-        <w:rPr/>
-      </w:pPr>
-      <w:r>
-        <w:rPr>
-          <w:rStyle w:val="Textooriginal"/>
-        </w:rPr>
-        <w:t>|  Panel     |                                                  |</w:t>
-      </w:r>
-    </w:p>
-    <w:p>
-      <w:pPr>
-        <w:pStyle w:val="Textopreformateado"/>
-        <w:bidi w:val="0"/>
-        <w:jc w:val="left"/>
-        <w:rPr/>
-      </w:pPr>
-      <w:r>
-        <w:rPr>
-          <w:rStyle w:val="Textooriginal"/>
-        </w:rPr>
-        <w:t>|  Libros    |   +--------------------------------------------+ |</w:t>
-      </w:r>
-    </w:p>
-    <w:p>
-      <w:pPr>
-        <w:pStyle w:val="Textopreformateado"/>
-        <w:bidi w:val="0"/>
-        <w:jc w:val="left"/>
-        <w:rPr/>
-      </w:pPr>
-      <w:r>
-        <w:rPr>
-          <w:rStyle w:val="Textooriginal"/>
-        </w:rPr>
-        <w:t>|  Categorías|   | panel: filtros + tabla + paginador         | |</w:t>
-      </w:r>
-    </w:p>
-    <w:p>
-      <w:pPr>
-        <w:pStyle w:val="Textopreformateado"/>
-        <w:bidi w:val="0"/>
-        <w:jc w:val="left"/>
-        <w:rPr/>
-      </w:pPr>
-      <w:r>
-        <w:rPr>
-          <w:rStyle w:val="Textooriginal"/>
-        </w:rPr>
-        <w:t>|  Clientes  |   | radio 12 - borde Outline Variant           | |</w:t>
-      </w:r>
-    </w:p>
-    <w:p>
-      <w:pPr>
-        <w:pStyle w:val="Textopreformateado"/>
-        <w:bidi w:val="0"/>
-        <w:jc w:val="left"/>
-        <w:rPr/>
-      </w:pPr>
-      <w:r>
-        <w:rPr>
-          <w:rStyle w:val="Textooriginal"/>
-        </w:rPr>
-        <w:t>|  Reservas  |   +--------------------------------------------+ |</w:t>
-      </w:r>
-    </w:p>
-    <w:p>
-      <w:pPr>
-        <w:pStyle w:val="Textopreformateado"/>
-        <w:bidi w:val="0"/>
-        <w:jc w:val="left"/>
-        <w:rPr/>
-      </w:pPr>
-      <w:r>
-        <w:rPr>
-          <w:rStyle w:val="Textooriginal"/>
-        </w:rPr>
-        <w:t>|  Asistente |                                                  |</w:t>
-      </w:r>
-    </w:p>
-    <w:p>
-      <w:pPr>
-        <w:pStyle w:val="Textopreformateado"/>
-        <w:bidi w:val="0"/>
-        <w:jc w:val="left"/>
-        <w:rPr/>
-      </w:pPr>
-      <w:r>
-        <w:rPr>
-          <w:rStyle w:val="Textooriginal"/>
-        </w:rPr>
-        <w:t>|  -------   |                                                  |</w:t>
-      </w:r>
-    </w:p>
-    <w:p>
-      <w:pPr>
-        <w:pStyle w:val="Textopreformateado"/>
-        <w:bidi w:val="0"/>
-        <w:jc w:val="left"/>
-        <w:rPr/>
-      </w:pPr>
-      <w:r>
-        <w:rPr>
-          <w:rStyle w:val="Textooriginal"/>
-        </w:rPr>
-        <w:t>|  usuario   |                                                  |</w:t>
-      </w:r>
-    </w:p>
-    <w:p>
-      <w:pPr>
-        <w:pStyle w:val="Textopreformateado"/>
-        <w:bidi w:val="0"/>
-        <w:spacing w:before="0" w:after="283"/>
-        <w:jc w:val="left"/>
-        <w:rPr/>
-      </w:pPr>
-      <w:r>
-        <w:rPr>
-          <w:rStyle w:val="Textooriginal"/>
-        </w:rPr>
-        <w:t>+------------+--------------------------------------------------+</w:t>
-      </w:r>
-    </w:p>
-    <w:p>
-      <w:pPr>
-        <w:pStyle w:val="Heading3"/>
-        <w:bidi w:val="0"/>
-        <w:jc w:val="left"/>
-        <w:rPr/>
-      </w:pPr>
-      <w:r>
-        <w:rPr/>
-        <w:t>3.1 Login</w:t>
-      </w:r>
-    </w:p>
-    <w:p>
-      <w:pPr>
-        <w:pStyle w:val="BodyText"/>
-        <w:bidi w:val="0"/>
-        <w:rPr/>
-      </w:pPr>
-      <w:r>
-        <w:rPr/>
-        <w:t xml:space="preserve">Tarjeta centrada sobre </w:t>
-      </w:r>
-      <w:r>
-        <w:rPr>
-          <w:rStyle w:val="Textooriginal"/>
-        </w:rPr>
-        <w:t>Surface</w:t>
-      </w:r>
-      <w:r>
-        <w:rPr/>
-        <w:t xml:space="preserve">, sin app shell. Ancho </w:t>
-      </w:r>
-      <w:r>
-        <w:rPr>
-          <w:rStyle w:val="Textooriginal"/>
-        </w:rPr>
-        <w:t>min(360px, 100%)</w:t>
-      </w:r>
-      <w:r>
-        <w:rPr/>
-        <w:t xml:space="preserve"> dentro de un contenedor con 16 px de relleno: en el escritorio son los 360 px de siempre y en un teléfono de 360 px la tarjeta deja margen a los dos lados en vez de morder los bordes.</w:t>
-      </w:r>
-    </w:p>
-    <w:p>
-      <w:pPr>
-        <w:pStyle w:val="BodyText"/>
-        <w:bidi w:val="0"/>
-        <w:rPr/>
-      </w:pPr>
-      <w:r>
-        <w:rPr/>
-        <w:t>De arriba abajo:</w:t>
+        <w:t>Y una escala menor, para el cromo denso.</w:t>
+      </w:r>
+      <w:r>
+        <w:rPr/>
+        <w:t xml:space="preserve"> Los siete estilos de arriba son los del archivo de Figma, y durante un tiempo fueron los únicos publicados aquí mientras las secciones 3.3 y 3.5 mandaban tamaños que esta tabla no recogía. Se publican ahora, porque existen en la aplicación y están medidos:</w:t>
       </w:r>
     </w:p>
     <w:tbl>
@@ -7641,8 +7429,10 @@
         </w:tblCellMar>
       </w:tblPr>
       <w:tblGrid>
-        <w:gridCol w:w="1310"/>
-        <w:gridCol w:w="8102"/>
+        <w:gridCol w:w="890"/>
+        <w:gridCol w:w="1304"/>
+        <w:gridCol w:w="3489"/>
+        <w:gridCol w:w="3729"/>
       </w:tblGrid>
       <w:tr>
         <w:trPr>
@@ -7650,7 +7440,7 @@
         </w:trPr>
         <w:tc>
           <w:tcPr>
-            <w:tcW w:w="1310" w:type="dxa"/>
+            <w:tcW w:w="890" w:type="dxa"/>
             <w:tcBorders/>
             <w:vAlign w:val="center"/>
           </w:tcPr>
@@ -7666,13 +7456,13 @@
             </w:pPr>
             <w:r>
               <w:rPr/>
-              <w:t>Bloque</w:t>
-            </w:r>
-          </w:p>
-        </w:tc>
-        <w:tc>
-          <w:tcPr>
-            <w:tcW w:w="8102" w:type="dxa"/>
+              <w:t>Tamaño</w:t>
+            </w:r>
+          </w:p>
+        </w:tc>
+        <w:tc>
+          <w:tcPr>
+            <w:tcW w:w="1304" w:type="dxa"/>
             <w:tcBorders/>
             <w:vAlign w:val="center"/>
           </w:tcPr>
@@ -7688,7 +7478,51 @@
             </w:pPr>
             <w:r>
               <w:rPr/>
-              <w:t>Especificación</w:t>
+              <w:t>Familia</w:t>
+            </w:r>
+          </w:p>
+        </w:tc>
+        <w:tc>
+          <w:tcPr>
+            <w:tcW w:w="3489" w:type="dxa"/>
+            <w:tcBorders/>
+            <w:vAlign w:val="center"/>
+          </w:tcPr>
+          <w:p>
+            <w:pPr>
+              <w:pStyle w:val="Ttulodelatabla"/>
+              <w:suppressLineNumbers/>
+              <w:shd w:fill="EEF1FD" w:val="clear"/>
+              <w:bidi w:val="0"/>
+              <w:spacing w:before="0" w:after="120"/>
+              <w:jc w:val="left"/>
+              <w:rPr/>
+            </w:pPr>
+            <w:r>
+              <w:rPr/>
+              <w:t>Dónde</w:t>
+            </w:r>
+          </w:p>
+        </w:tc>
+        <w:tc>
+          <w:tcPr>
+            <w:tcW w:w="3729" w:type="dxa"/>
+            <w:tcBorders/>
+            <w:vAlign w:val="center"/>
+          </w:tcPr>
+          <w:p>
+            <w:pPr>
+              <w:pStyle w:val="Ttulodelatabla"/>
+              <w:suppressLineNumbers/>
+              <w:shd w:fill="EEF1FD" w:val="clear"/>
+              <w:bidi w:val="0"/>
+              <w:spacing w:before="0" w:after="120"/>
+              <w:jc w:val="left"/>
+              <w:rPr/>
+            </w:pPr>
+            <w:r>
+              <w:rPr/>
+              <w:t>Por qué no es un paso de la escala mayor</w:t>
             </w:r>
           </w:p>
         </w:tc>
@@ -7697,93 +7531,81 @@
         <w:trPr/>
         <w:tc>
           <w:tcPr>
-            <w:tcW w:w="1310" w:type="dxa"/>
-            <w:tcBorders/>
-            <w:vAlign w:val="center"/>
-          </w:tcPr>
-          <w:p>
-            <w:pPr>
-              <w:pStyle w:val="Contenidodelatabla"/>
-              <w:bidi w:val="0"/>
-              <w:spacing w:before="0" w:after="120"/>
-              <w:jc w:val="left"/>
-              <w:rPr/>
-            </w:pPr>
-            <w:r>
-              <w:rPr>
-                <w:rStyle w:val="Strong"/>
-              </w:rPr>
-              <w:t>Marca</w:t>
-            </w:r>
-            <w:r>
-              <w:rPr/>
-              <w:t>, centrada</w:t>
-            </w:r>
-          </w:p>
-        </w:tc>
-        <w:tc>
-          <w:tcPr>
-            <w:tcW w:w="8102" w:type="dxa"/>
-            <w:tcBorders/>
-            <w:vAlign w:val="center"/>
-          </w:tcPr>
-          <w:p>
-            <w:pPr>
-              <w:pStyle w:val="Contenidodelatabla"/>
-              <w:bidi w:val="0"/>
-              <w:spacing w:before="0" w:after="120"/>
-              <w:jc w:val="left"/>
-              <w:rPr/>
-            </w:pPr>
-            <w:r>
-              <w:rPr/>
-              <w:t xml:space="preserve">Icono </w:t>
-            </w:r>
-            <w:r>
-              <w:rPr>
-                <w:rStyle w:val="Textooriginal"/>
-              </w:rPr>
-              <w:t>menu_book</w:t>
-            </w:r>
-            <w:r>
-              <w:rPr/>
-              <w:t xml:space="preserve"> de 40 px en </w:t>
-            </w:r>
-            <w:r>
-              <w:rPr>
-                <w:rStyle w:val="Textooriginal"/>
-              </w:rPr>
-              <w:t>Primary</w:t>
-            </w:r>
-            <w:r>
-              <w:rPr/>
-              <w:t xml:space="preserve">; debajo las siglas </w:t>
-            </w:r>
-            <w:r>
-              <w:rPr>
-                <w:rStyle w:val="Strong"/>
-              </w:rPr>
-              <w:t>SIGBI</w:t>
-            </w:r>
-            <w:r>
-              <w:rPr/>
-              <w:t xml:space="preserve"> en Lora SemiBold 28/36; debajo </w:t>
-            </w:r>
-            <w:r>
-              <w:rPr>
-                <w:rStyle w:val="Strong"/>
-              </w:rPr>
-              <w:t>Sistema de Gestión Bibliotecaria Inteligente</w:t>
-            </w:r>
-            <w:r>
-              <w:rPr/>
-              <w:t xml:space="preserve"> en 12/16, </w:t>
-            </w:r>
-            <w:r>
-              <w:rPr>
-                <w:rStyle w:val="Textooriginal"/>
-              </w:rPr>
-              <w:t>On Surface Variant</w:t>
+            <w:tcW w:w="890" w:type="dxa"/>
+            <w:tcBorders/>
+            <w:vAlign w:val="center"/>
+          </w:tcPr>
+          <w:p>
+            <w:pPr>
+              <w:pStyle w:val="Contenidodelatabla"/>
+              <w:bidi w:val="0"/>
+              <w:spacing w:before="0" w:after="120"/>
+              <w:jc w:val="left"/>
+              <w:rPr/>
+            </w:pPr>
+            <w:r>
+              <w:rPr/>
+              <w:t>21 / 26</w:t>
+            </w:r>
+          </w:p>
+        </w:tc>
+        <w:tc>
+          <w:tcPr>
+            <w:tcW w:w="1304" w:type="dxa"/>
+            <w:tcBorders/>
+            <w:vAlign w:val="center"/>
+          </w:tcPr>
+          <w:p>
+            <w:pPr>
+              <w:pStyle w:val="Contenidodelatabla"/>
+              <w:bidi w:val="0"/>
+              <w:spacing w:before="0" w:after="120"/>
+              <w:jc w:val="left"/>
+              <w:rPr/>
+            </w:pPr>
+            <w:r>
+              <w:rPr/>
+              <w:t>Lora SemiBold</w:t>
+            </w:r>
+          </w:p>
+        </w:tc>
+        <w:tc>
+          <w:tcPr>
+            <w:tcW w:w="3489" w:type="dxa"/>
+            <w:tcBorders/>
+            <w:vAlign w:val="center"/>
+          </w:tcPr>
+          <w:p>
+            <w:pPr>
+              <w:pStyle w:val="Contenidodelatabla"/>
+              <w:bidi w:val="0"/>
+              <w:spacing w:before="0" w:after="120"/>
+              <w:jc w:val="left"/>
+              <w:rPr/>
+            </w:pPr>
+            <w:r>
+              <w:rPr/>
+              <w:t>Siglas de la marca del menú lateral</w:t>
+            </w:r>
+          </w:p>
+        </w:tc>
+        <w:tc>
+          <w:tcPr>
+            <w:tcW w:w="3729" w:type="dxa"/>
+            <w:tcBorders/>
+            <w:vAlign w:val="center"/>
+          </w:tcPr>
+          <w:p>
+            <w:pPr>
+              <w:pStyle w:val="Contenidodelatabla"/>
+              <w:bidi w:val="0"/>
+              <w:spacing w:before="0" w:after="120"/>
+              <w:jc w:val="left"/>
+              <w:rPr/>
+            </w:pPr>
+            <w:r>
+              <w:rPr/>
+              <w:t>28 no cabe en los 248 px junto al icono</w:t>
             </w:r>
           </w:p>
         </w:tc>
@@ -7792,47 +7614,81 @@
         <w:trPr/>
         <w:tc>
           <w:tcPr>
-            <w:tcW w:w="1310" w:type="dxa"/>
-            <w:tcBorders/>
-            <w:vAlign w:val="center"/>
-          </w:tcPr>
-          <w:p>
-            <w:pPr>
-              <w:pStyle w:val="Contenidodelatabla"/>
-              <w:bidi w:val="0"/>
-              <w:spacing w:before="0" w:after="120"/>
-              <w:jc w:val="left"/>
-              <w:rPr/>
-            </w:pPr>
-            <w:r>
-              <w:rPr/>
-              <w:t>Subtítulo</w:t>
-            </w:r>
-          </w:p>
-        </w:tc>
-        <w:tc>
-          <w:tcPr>
-            <w:tcW w:w="8102" w:type="dxa"/>
-            <w:tcBorders/>
-            <w:vAlign w:val="center"/>
-          </w:tcPr>
-          <w:p>
-            <w:pPr>
-              <w:pStyle w:val="Contenidodelatabla"/>
-              <w:bidi w:val="0"/>
-              <w:spacing w:before="0" w:after="120"/>
-              <w:jc w:val="left"/>
-              <w:rPr/>
-            </w:pPr>
-            <w:r>
-              <w:rPr/>
-              <w:t xml:space="preserve">"Ingrese sus credenciales", centrado, </w:t>
-            </w:r>
-            <w:r>
-              <w:rPr>
-                <w:rStyle w:val="Textooriginal"/>
-              </w:rPr>
-              <w:t>On Surface Variant</w:t>
+            <w:tcW w:w="890" w:type="dxa"/>
+            <w:tcBorders/>
+            <w:vAlign w:val="center"/>
+          </w:tcPr>
+          <w:p>
+            <w:pPr>
+              <w:pStyle w:val="Contenidodelatabla"/>
+              <w:bidi w:val="0"/>
+              <w:spacing w:before="0" w:after="120"/>
+              <w:jc w:val="left"/>
+              <w:rPr/>
+            </w:pPr>
+            <w:r>
+              <w:rPr/>
+              <w:t>13 / 18</w:t>
+            </w:r>
+          </w:p>
+        </w:tc>
+        <w:tc>
+          <w:tcPr>
+            <w:tcW w:w="1304" w:type="dxa"/>
+            <w:tcBorders/>
+            <w:vAlign w:val="center"/>
+          </w:tcPr>
+          <w:p>
+            <w:pPr>
+              <w:pStyle w:val="Contenidodelatabla"/>
+              <w:bidi w:val="0"/>
+              <w:spacing w:before="0" w:after="120"/>
+              <w:jc w:val="left"/>
+              <w:rPr/>
+            </w:pPr>
+            <w:r>
+              <w:rPr/>
+              <w:t>IBM Plex Sans Regular</w:t>
+            </w:r>
+          </w:p>
+        </w:tc>
+        <w:tc>
+          <w:tcPr>
+            <w:tcW w:w="3489" w:type="dxa"/>
+            <w:tcBorders/>
+            <w:vAlign w:val="center"/>
+          </w:tcPr>
+          <w:p>
+            <w:pPr>
+              <w:pStyle w:val="Contenidodelatabla"/>
+              <w:bidi w:val="0"/>
+              <w:spacing w:before="0" w:after="120"/>
+              <w:jc w:val="left"/>
+              <w:rPr/>
+            </w:pPr>
+            <w:r>
+              <w:rPr/>
+              <w:t>Subtítulo de la cabecera</w:t>
+            </w:r>
+          </w:p>
+        </w:tc>
+        <w:tc>
+          <w:tcPr>
+            <w:tcW w:w="3729" w:type="dxa"/>
+            <w:tcBorders/>
+            <w:vAlign w:val="center"/>
+          </w:tcPr>
+          <w:p>
+            <w:pPr>
+              <w:pStyle w:val="Contenidodelatabla"/>
+              <w:bidi w:val="0"/>
+              <w:spacing w:before="0" w:after="120"/>
+              <w:jc w:val="left"/>
+              <w:rPr/>
+            </w:pPr>
+            <w:r>
+              <w:rPr/>
+              <w:t>Acompaña a un título de 28 sin competir con él</w:t>
             </w:r>
           </w:p>
         </w:tc>
@@ -7841,87 +7697,81 @@
         <w:trPr/>
         <w:tc>
           <w:tcPr>
-            <w:tcW w:w="1310" w:type="dxa"/>
-            <w:tcBorders/>
-            <w:vAlign w:val="center"/>
-          </w:tcPr>
-          <w:p>
-            <w:pPr>
-              <w:pStyle w:val="Contenidodelatabla"/>
-              <w:bidi w:val="0"/>
-              <w:spacing w:before="0" w:after="120"/>
-              <w:jc w:val="left"/>
-              <w:rPr/>
-            </w:pPr>
-            <w:r>
-              <w:rPr/>
-              <w:t>Correo</w:t>
-            </w:r>
-          </w:p>
-        </w:tc>
-        <w:tc>
-          <w:tcPr>
-            <w:tcW w:w="8102" w:type="dxa"/>
-            <w:tcBorders/>
-            <w:vAlign w:val="center"/>
-          </w:tcPr>
-          <w:p>
-            <w:pPr>
-              <w:pStyle w:val="Contenidodelatabla"/>
-              <w:bidi w:val="0"/>
-              <w:spacing w:before="0" w:after="120"/>
-              <w:jc w:val="left"/>
-              <w:rPr/>
-            </w:pPr>
-            <w:r>
-              <w:rPr/>
-              <w:t xml:space="preserve">Campo relleno. </w:t>
-            </w:r>
-            <w:r>
-              <w:rPr>
-                <w:rStyle w:val="Textooriginal"/>
-              </w:rPr>
-              <w:t>type="email"</w:t>
-            </w:r>
-            <w:r>
-              <w:rPr/>
-              <w:t xml:space="preserve"> con </w:t>
-            </w:r>
-            <w:r>
-              <w:rPr>
-                <w:rStyle w:val="Textooriginal"/>
-              </w:rPr>
-              <w:t>inputmode="email"</w:t>
-            </w:r>
-            <w:r>
-              <w:rPr/>
-              <w:t xml:space="preserve">, </w:t>
-            </w:r>
-            <w:r>
-              <w:rPr>
-                <w:rStyle w:val="Textooriginal"/>
-              </w:rPr>
-              <w:t>autocapitalize="none"</w:t>
-            </w:r>
-            <w:r>
-              <w:rPr/>
-              <w:t xml:space="preserve">, </w:t>
-            </w:r>
-            <w:r>
-              <w:rPr>
-                <w:rStyle w:val="Textooriginal"/>
-              </w:rPr>
-              <w:t>autocorrect="off"</w:t>
-            </w:r>
-            <w:r>
-              <w:rPr/>
-              <w:t xml:space="preserve"> y </w:t>
-            </w:r>
-            <w:r>
-              <w:rPr>
-                <w:rStyle w:val="Textooriginal"/>
-              </w:rPr>
-              <w:t>spellcheck="false"</w:t>
+            <w:tcW w:w="890" w:type="dxa"/>
+            <w:tcBorders/>
+            <w:vAlign w:val="center"/>
+          </w:tcPr>
+          <w:p>
+            <w:pPr>
+              <w:pStyle w:val="Contenidodelatabla"/>
+              <w:bidi w:val="0"/>
+              <w:spacing w:before="0" w:after="120"/>
+              <w:jc w:val="left"/>
+              <w:rPr/>
+            </w:pPr>
+            <w:r>
+              <w:rPr/>
+              <w:t>11 / 14</w:t>
+            </w:r>
+          </w:p>
+        </w:tc>
+        <w:tc>
+          <w:tcPr>
+            <w:tcW w:w="1304" w:type="dxa"/>
+            <w:tcBorders/>
+            <w:vAlign w:val="center"/>
+          </w:tcPr>
+          <w:p>
+            <w:pPr>
+              <w:pStyle w:val="Contenidodelatabla"/>
+              <w:bidi w:val="0"/>
+              <w:spacing w:before="0" w:after="120"/>
+              <w:jc w:val="left"/>
+              <w:rPr/>
+            </w:pPr>
+            <w:r>
+              <w:rPr/>
+              <w:t>IBM Plex Sans Regular</w:t>
+            </w:r>
+          </w:p>
+        </w:tc>
+        <w:tc>
+          <w:tcPr>
+            <w:tcW w:w="3489" w:type="dxa"/>
+            <w:tcBorders/>
+            <w:vAlign w:val="center"/>
+          </w:tcPr>
+          <w:p>
+            <w:pPr>
+              <w:pStyle w:val="Contenidodelatabla"/>
+              <w:bidi w:val="0"/>
+              <w:spacing w:before="0" w:after="120"/>
+              <w:jc w:val="left"/>
+              <w:rPr/>
+            </w:pPr>
+            <w:r>
+              <w:rPr/>
+              <w:t>Bajada de la marca, perfil de usuario, rótulos de la barra inferior y del panel</w:t>
+            </w:r>
+          </w:p>
+        </w:tc>
+        <w:tc>
+          <w:tcPr>
+            <w:tcW w:w="3729" w:type="dxa"/>
+            <w:tcBorders/>
+            <w:vAlign w:val="center"/>
+          </w:tcPr>
+          <w:p>
+            <w:pPr>
+              <w:pStyle w:val="Contenidodelatabla"/>
+              <w:bidi w:val="0"/>
+              <w:spacing w:before="0" w:after="120"/>
+              <w:jc w:val="left"/>
+              <w:rPr/>
+            </w:pPr>
+            <w:r>
+              <w:rPr/>
+              <w:t>Texto de apoyo en piezas de ancho fijo; nunca contenido que haya que leer seguido</w:t>
             </w:r>
           </w:p>
         </w:tc>
@@ -7930,71 +7780,553 @@
         <w:trPr/>
         <w:tc>
           <w:tcPr>
-            <w:tcW w:w="1310" w:type="dxa"/>
-            <w:tcBorders/>
-            <w:vAlign w:val="center"/>
-          </w:tcPr>
-          <w:p>
-            <w:pPr>
-              <w:pStyle w:val="Contenidodelatabla"/>
-              <w:bidi w:val="0"/>
-              <w:spacing w:before="0" w:after="120"/>
-              <w:jc w:val="left"/>
-              <w:rPr/>
-            </w:pPr>
-            <w:r>
-              <w:rPr/>
-              <w:t>Contraseña</w:t>
-            </w:r>
-          </w:p>
-        </w:tc>
-        <w:tc>
-          <w:tcPr>
-            <w:tcW w:w="8102" w:type="dxa"/>
-            <w:tcBorders/>
-            <w:vAlign w:val="center"/>
-          </w:tcPr>
-          <w:p>
-            <w:pPr>
-              <w:pStyle w:val="Contenidodelatabla"/>
-              <w:bidi w:val="0"/>
-              <w:spacing w:before="0" w:after="120"/>
-              <w:jc w:val="left"/>
-              <w:rPr/>
-            </w:pPr>
-            <w:r>
-              <w:rPr/>
-              <w:t xml:space="preserve">Campo relleno con </w:t>
-            </w:r>
-            <w:r>
-              <w:rPr>
-                <w:rStyle w:val="Strong"/>
-              </w:rPr>
-              <w:t>conmutador de visibilidad</w:t>
-            </w:r>
-            <w:r>
-              <w:rPr/>
-              <w:t xml:space="preserve"> al final (</w:t>
-            </w:r>
-            <w:r>
-              <w:rPr>
-                <w:rStyle w:val="Textooriginal"/>
-              </w:rPr>
-              <w:t>visibility</w:t>
-            </w:r>
-            <w:r>
-              <w:rPr/>
-              <w:t xml:space="preserve"> / </w:t>
-            </w:r>
-            <w:r>
-              <w:rPr>
-                <w:rStyle w:val="Textooriginal"/>
-              </w:rPr>
-              <w:t>visibility_off</w:t>
-            </w:r>
-            <w:r>
-              <w:rPr/>
-              <w:t>)</w:t>
+            <w:tcW w:w="890" w:type="dxa"/>
+            <w:tcBorders/>
+            <w:vAlign w:val="center"/>
+          </w:tcPr>
+          <w:p>
+            <w:pPr>
+              <w:pStyle w:val="Contenidodelatabla"/>
+              <w:bidi w:val="0"/>
+              <w:spacing w:before="0" w:after="120"/>
+              <w:jc w:val="left"/>
+              <w:rPr/>
+            </w:pPr>
+            <w:r>
+              <w:rPr/>
+              <w:t>24 / 30</w:t>
+            </w:r>
+          </w:p>
+        </w:tc>
+        <w:tc>
+          <w:tcPr>
+            <w:tcW w:w="1304" w:type="dxa"/>
+            <w:tcBorders/>
+            <w:vAlign w:val="center"/>
+          </w:tcPr>
+          <w:p>
+            <w:pPr>
+              <w:pStyle w:val="Contenidodelatabla"/>
+              <w:bidi w:val="0"/>
+              <w:spacing w:before="0" w:after="120"/>
+              <w:jc w:val="left"/>
+              <w:rPr/>
+            </w:pPr>
+            <w:r>
+              <w:rPr/>
+              <w:t>Lora SemiBold</w:t>
+            </w:r>
+          </w:p>
+        </w:tc>
+        <w:tc>
+          <w:tcPr>
+            <w:tcW w:w="3489" w:type="dxa"/>
+            <w:tcBorders/>
+            <w:vAlign w:val="center"/>
+          </w:tcPr>
+          <w:p>
+            <w:pPr>
+              <w:pStyle w:val="Contenidodelatabla"/>
+              <w:bidi w:val="0"/>
+              <w:spacing w:before="0" w:after="120"/>
+              <w:jc w:val="left"/>
+              <w:rPr/>
+            </w:pPr>
+            <w:r>
+              <w:rPr/>
+              <w:t>Título de página por debajo de 1024 px (sección 3.5)</w:t>
+            </w:r>
+          </w:p>
+        </w:tc>
+        <w:tc>
+          <w:tcPr>
+            <w:tcW w:w="3729" w:type="dxa"/>
+            <w:tcBorders/>
+            <w:vAlign w:val="center"/>
+          </w:tcPr>
+          <w:p>
+            <w:pPr>
+              <w:pStyle w:val="Contenidodelatabla"/>
+              <w:bidi w:val="0"/>
+              <w:spacing w:before="0" w:after="120"/>
+              <w:jc w:val="left"/>
+              <w:rPr/>
+            </w:pPr>
+            <w:r>
+              <w:rPr/>
+              <w:t xml:space="preserve">Variante compacta de </w:t>
+            </w:r>
+            <w:r>
+              <w:rPr>
+                <w:rStyle w:val="Textooriginal"/>
+              </w:rPr>
+              <w:t>Headline medium</w:t>
+            </w:r>
+          </w:p>
+        </w:tc>
+      </w:tr>
+    </w:tbl>
+    <w:p>
+      <w:pPr>
+        <w:pStyle w:val="BodyText"/>
+        <w:bidi w:val="0"/>
+        <w:rPr/>
+      </w:pPr>
+      <w:r>
+        <w:rPr>
+          <w:rStyle w:val="Strong"/>
+        </w:rPr>
+        <w:t>La regla que ordena las dos tablas:</w:t>
+      </w:r>
+      <w:r>
+        <w:rPr/>
+        <w:t xml:space="preserve"> todo lo que el usuario </w:t>
+      </w:r>
+      <w:r>
+        <w:rPr>
+          <w:rStyle w:val="Strong"/>
+        </w:rPr>
+        <w:t>lee</w:t>
+      </w:r>
+      <w:r>
+        <w:rPr/>
+        <w:t xml:space="preserve"> -nombres, mensajes, celdas, campos- sale de la escala mayor, y su mínimo es </w:t>
+      </w:r>
+      <w:r>
+        <w:rPr>
+          <w:rStyle w:val="Strong"/>
+        </w:rPr>
+        <w:t>14</w:t>
+      </w:r>
+      <w:r>
+        <w:rPr/>
+        <w:t xml:space="preserve">. La escala menor es solo para </w:t>
+      </w:r>
+      <w:r>
+        <w:rPr>
+          <w:rStyle w:val="Strong"/>
+        </w:rPr>
+        <w:t>rótulos de apoyo en cromo de ancho fijo</w:t>
+      </w:r>
+      <w:r>
+        <w:rPr/>
+        <w:t xml:space="preserve">, donde el ancho manda y el texto se reconoce más que se lee. Un tamaño menor de 14 en contenido es un fallo, no una decisión: así se coló un 12 px en el nombre del sistema del </w:t>
+      </w:r>
+      <w:r>
+        <w:rPr>
+          <w:rStyle w:val="Textooriginal"/>
+        </w:rPr>
+        <w:t>login</w:t>
+      </w:r>
+      <w:r>
+        <w:rPr/>
+        <w:t>, que a un teléfono en la mano le resultaba demasiado pequeño (DV-39 de AN090).</w:t>
+      </w:r>
+    </w:p>
+    <w:p>
+      <w:pPr>
+        <w:pStyle w:val="BodyText"/>
+        <w:bidi w:val="0"/>
+        <w:rPr/>
+      </w:pPr>
+      <w:r>
+        <w:rPr>
+          <w:rStyle w:val="Strong"/>
+        </w:rPr>
+        <w:t>Fuentes verificadas.</w:t>
+      </w:r>
+      <w:r>
+        <w:rPr/>
+        <w:t xml:space="preserve"> Las tres cargaron en Figma sin caer al sustituto Inter. El generador tiene un mecanismo de reserva a Inter y avisa de la familia que faltó, para que un render con la tipografía equivocada no pase por bueno.</w:t>
+      </w:r>
+    </w:p>
+    <w:p>
+      <w:pPr>
+        <w:pStyle w:val="BodyText"/>
+        <w:bidi w:val="0"/>
+        <w:rPr/>
+      </w:pPr>
+      <w:r>
+        <w:rPr>
+          <w:rStyle w:val="Strong"/>
+        </w:rPr>
+        <w:t>Iconografía:</w:t>
+      </w:r>
+      <w:r>
+        <w:rPr/>
+        <w:t xml:space="preserve"> trazo de 20 px en el menú y 18 px en los controles, con el peso del icono alineado al texto que acompaña. Ningún icono va solo si es la única forma de entender la acción: los botones de fila (editar, eliminar) llevan rótulo accesible.</w:t>
+      </w:r>
+    </w:p>
+    <w:p>
+      <w:pPr>
+        <w:pStyle w:val="Lneahorizontal"/>
+        <w:bidi w:val="0"/>
+        <w:jc w:val="left"/>
+        <w:rPr/>
+      </w:pPr>
+      <w:r>
+        <w:rPr/>
+      </w:r>
+    </w:p>
+    <w:p>
+      <w:pPr>
+        <w:pStyle w:val="Heading2"/>
+        <w:bidi w:val="0"/>
+        <w:rPr/>
+      </w:pPr>
+      <w:r>
+        <w:rPr/>
+        <w:t>3. Estructura de la aplicación (app shell)</w:t>
+      </w:r>
+    </w:p>
+    <w:p>
+      <w:pPr>
+        <w:pStyle w:val="BodyText"/>
+        <w:bidi w:val="0"/>
+        <w:rPr/>
+      </w:pPr>
+      <w:r>
+        <w:rPr/>
+        <w:t xml:space="preserve">Lienzo de escritorio: </w:t>
+      </w:r>
+      <w:r>
+        <w:rPr>
+          <w:rStyle w:val="Strong"/>
+        </w:rPr>
+        <w:t>1440 x 900</w:t>
+      </w:r>
+      <w:r>
+        <w:rPr/>
+        <w:t>. Dos zonas fijas - menú lateral de 248 px y columna de contenido de 1192 px.</w:t>
+      </w:r>
+    </w:p>
+    <w:p>
+      <w:pPr>
+        <w:pStyle w:val="Textopreformateado"/>
+        <w:bidi w:val="0"/>
+        <w:jc w:val="left"/>
+        <w:rPr/>
+      </w:pPr>
+      <w:r>
+        <w:rPr>
+          <w:rStyle w:val="Textooriginal"/>
+        </w:rPr>
+        <w:t>+------------+--------------------------------------------------+</w:t>
+      </w:r>
+    </w:p>
+    <w:p>
+      <w:pPr>
+        <w:pStyle w:val="Textopreformateado"/>
+        <w:bidi w:val="0"/>
+        <w:jc w:val="left"/>
+        <w:rPr/>
+      </w:pPr>
+      <w:r>
+        <w:rPr>
+          <w:rStyle w:val="Textooriginal"/>
+        </w:rPr>
+        <w:t>|  sidenav   |  topbar  80 px                                   |</w:t>
+      </w:r>
+    </w:p>
+    <w:p>
+      <w:pPr>
+        <w:pStyle w:val="Textopreformateado"/>
+        <w:bidi w:val="0"/>
+        <w:jc w:val="left"/>
+        <w:rPr/>
+      </w:pPr>
+      <w:r>
+        <w:rPr>
+          <w:rStyle w:val="Textooriginal"/>
+        </w:rPr>
+        <w:t>|  248 px    |  Título (Lora 28) + subtítulo - acciones a la dcha|</w:t>
+      </w:r>
+    </w:p>
+    <w:p>
+      <w:pPr>
+        <w:pStyle w:val="Textopreformateado"/>
+        <w:bidi w:val="0"/>
+        <w:jc w:val="left"/>
+        <w:rPr/>
+      </w:pPr>
+      <w:r>
+        <w:rPr>
+          <w:rStyle w:val="Textooriginal"/>
+        </w:rPr>
+        <w:t>|            +--------------------------------------------------+</w:t>
+      </w:r>
+    </w:p>
+    <w:p>
+      <w:pPr>
+        <w:pStyle w:val="Textopreformateado"/>
+        <w:bidi w:val="0"/>
+        <w:jc w:val="left"/>
+        <w:rPr/>
+      </w:pPr>
+      <w:r>
+        <w:rPr>
+          <w:rStyle w:val="Textooriginal"/>
+        </w:rPr>
+        <w:t>|  marca     |                                                  |</w:t>
+      </w:r>
+    </w:p>
+    <w:p>
+      <w:pPr>
+        <w:pStyle w:val="Textopreformateado"/>
+        <w:bidi w:val="0"/>
+        <w:jc w:val="left"/>
+        <w:rPr/>
+      </w:pPr>
+      <w:r>
+        <w:rPr>
+          <w:rStyle w:val="Textooriginal"/>
+        </w:rPr>
+        <w:t>|  -------   |  body   padding 32 px - gap 20 px                |</w:t>
+      </w:r>
+    </w:p>
+    <w:p>
+      <w:pPr>
+        <w:pStyle w:val="Textopreformateado"/>
+        <w:bidi w:val="0"/>
+        <w:jc w:val="left"/>
+        <w:rPr/>
+      </w:pPr>
+      <w:r>
+        <w:rPr>
+          <w:rStyle w:val="Textooriginal"/>
+        </w:rPr>
+        <w:t>|  Panel     |                                                  |</w:t>
+      </w:r>
+    </w:p>
+    <w:p>
+      <w:pPr>
+        <w:pStyle w:val="Textopreformateado"/>
+        <w:bidi w:val="0"/>
+        <w:jc w:val="left"/>
+        <w:rPr/>
+      </w:pPr>
+      <w:r>
+        <w:rPr>
+          <w:rStyle w:val="Textooriginal"/>
+        </w:rPr>
+        <w:t>|  Libros    |   +--------------------------------------------+ |</w:t>
+      </w:r>
+    </w:p>
+    <w:p>
+      <w:pPr>
+        <w:pStyle w:val="Textopreformateado"/>
+        <w:bidi w:val="0"/>
+        <w:jc w:val="left"/>
+        <w:rPr/>
+      </w:pPr>
+      <w:r>
+        <w:rPr>
+          <w:rStyle w:val="Textooriginal"/>
+        </w:rPr>
+        <w:t>|  Categorías|   | panel: filtros + tabla + paginador         | |</w:t>
+      </w:r>
+    </w:p>
+    <w:p>
+      <w:pPr>
+        <w:pStyle w:val="Textopreformateado"/>
+        <w:bidi w:val="0"/>
+        <w:jc w:val="left"/>
+        <w:rPr/>
+      </w:pPr>
+      <w:r>
+        <w:rPr>
+          <w:rStyle w:val="Textooriginal"/>
+        </w:rPr>
+        <w:t>|  Clientes  |   | radio 12 - borde Outline Variant           | |</w:t>
+      </w:r>
+    </w:p>
+    <w:p>
+      <w:pPr>
+        <w:pStyle w:val="Textopreformateado"/>
+        <w:bidi w:val="0"/>
+        <w:jc w:val="left"/>
+        <w:rPr/>
+      </w:pPr>
+      <w:r>
+        <w:rPr>
+          <w:rStyle w:val="Textooriginal"/>
+        </w:rPr>
+        <w:t>|  Reservas  |   +--------------------------------------------+ |</w:t>
+      </w:r>
+    </w:p>
+    <w:p>
+      <w:pPr>
+        <w:pStyle w:val="Textopreformateado"/>
+        <w:bidi w:val="0"/>
+        <w:jc w:val="left"/>
+        <w:rPr/>
+      </w:pPr>
+      <w:r>
+        <w:rPr>
+          <w:rStyle w:val="Textooriginal"/>
+        </w:rPr>
+        <w:t>|  Asistente |                                                  |</w:t>
+      </w:r>
+    </w:p>
+    <w:p>
+      <w:pPr>
+        <w:pStyle w:val="Textopreformateado"/>
+        <w:bidi w:val="0"/>
+        <w:jc w:val="left"/>
+        <w:rPr/>
+      </w:pPr>
+      <w:r>
+        <w:rPr>
+          <w:rStyle w:val="Textooriginal"/>
+        </w:rPr>
+        <w:t>|  -------   |                                                  |</w:t>
+      </w:r>
+    </w:p>
+    <w:p>
+      <w:pPr>
+        <w:pStyle w:val="Textopreformateado"/>
+        <w:bidi w:val="0"/>
+        <w:jc w:val="left"/>
+        <w:rPr/>
+      </w:pPr>
+      <w:r>
+        <w:rPr>
+          <w:rStyle w:val="Textooriginal"/>
+        </w:rPr>
+        <w:t>|  usuario   |                                                  |</w:t>
+      </w:r>
+    </w:p>
+    <w:p>
+      <w:pPr>
+        <w:pStyle w:val="Textopreformateado"/>
+        <w:bidi w:val="0"/>
+        <w:spacing w:before="0" w:after="283"/>
+        <w:jc w:val="left"/>
+        <w:rPr/>
+      </w:pPr>
+      <w:r>
+        <w:rPr>
+          <w:rStyle w:val="Textooriginal"/>
+        </w:rPr>
+        <w:t>+------------+--------------------------------------------------+</w:t>
+      </w:r>
+    </w:p>
+    <w:p>
+      <w:pPr>
+        <w:pStyle w:val="Heading3"/>
+        <w:bidi w:val="0"/>
+        <w:jc w:val="left"/>
+        <w:rPr/>
+      </w:pPr>
+      <w:r>
+        <w:rPr/>
+        <w:t>3.1 Login</w:t>
+      </w:r>
+    </w:p>
+    <w:p>
+      <w:pPr>
+        <w:pStyle w:val="BodyText"/>
+        <w:bidi w:val="0"/>
+        <w:rPr/>
+      </w:pPr>
+      <w:r>
+        <w:rPr/>
+        <w:t xml:space="preserve">Tarjeta centrada sobre </w:t>
+      </w:r>
+      <w:r>
+        <w:rPr>
+          <w:rStyle w:val="Textooriginal"/>
+        </w:rPr>
+        <w:t>Surface</w:t>
+      </w:r>
+      <w:r>
+        <w:rPr/>
+        <w:t xml:space="preserve">, sin app shell. Ancho </w:t>
+      </w:r>
+      <w:r>
+        <w:rPr>
+          <w:rStyle w:val="Textooriginal"/>
+        </w:rPr>
+        <w:t>min(360px, 100%)</w:t>
+      </w:r>
+      <w:r>
+        <w:rPr/>
+        <w:t xml:space="preserve"> dentro de un contenedor con 16 px de relleno: en el escritorio son los 360 px de siempre y en un teléfono de 360 px la tarjeta deja margen a los dos lados en vez de morder los bordes.</w:t>
+      </w:r>
+    </w:p>
+    <w:p>
+      <w:pPr>
+        <w:pStyle w:val="BodyText"/>
+        <w:bidi w:val="0"/>
+        <w:rPr/>
+      </w:pPr>
+      <w:r>
+        <w:rPr/>
+        <w:t>De arriba abajo:</w:t>
+      </w:r>
+    </w:p>
+    <w:tbl>
+      <w:tblPr>
+        <w:tblW w:w="9412" w:type="dxa"/>
+        <w:jc w:val="left"/>
+        <w:tblInd w:w="28" w:type="dxa"/>
+        <w:tblLayout w:type="fixed"/>
+        <w:tblCellMar>
+          <w:top w:w="28" w:type="dxa"/>
+          <w:left w:w="28" w:type="dxa"/>
+          <w:bottom w:w="28" w:type="dxa"/>
+          <w:right w:w="28" w:type="dxa"/>
+        </w:tblCellMar>
+      </w:tblPr>
+      <w:tblGrid>
+        <w:gridCol w:w="1205"/>
+        <w:gridCol w:w="8207"/>
+      </w:tblGrid>
+      <w:tr>
+        <w:trPr>
+          <w:tblHeader w:val="true"/>
+        </w:trPr>
+        <w:tc>
+          <w:tcPr>
+            <w:tcW w:w="1205" w:type="dxa"/>
+            <w:tcBorders/>
+            <w:vAlign w:val="center"/>
+          </w:tcPr>
+          <w:p>
+            <w:pPr>
+              <w:pStyle w:val="Ttulodelatabla"/>
+              <w:suppressLineNumbers/>
+              <w:shd w:fill="EEF1FD" w:val="clear"/>
+              <w:bidi w:val="0"/>
+              <w:spacing w:before="0" w:after="120"/>
+              <w:jc w:val="left"/>
+              <w:rPr/>
+            </w:pPr>
+            <w:r>
+              <w:rPr/>
+              <w:t>Bloque</w:t>
+            </w:r>
+          </w:p>
+        </w:tc>
+        <w:tc>
+          <w:tcPr>
+            <w:tcW w:w="8207" w:type="dxa"/>
+            <w:tcBorders/>
+            <w:vAlign w:val="center"/>
+          </w:tcPr>
+          <w:p>
+            <w:pPr>
+              <w:pStyle w:val="Ttulodelatabla"/>
+              <w:suppressLineNumbers/>
+              <w:shd w:fill="EEF1FD" w:val="clear"/>
+              <w:bidi w:val="0"/>
+              <w:spacing w:before="0" w:after="120"/>
+              <w:jc w:val="left"/>
+              <w:rPr/>
+            </w:pPr>
+            <w:r>
+              <w:rPr/>
+              <w:t>Especificación</w:t>
             </w:r>
           </w:p>
         </w:tc>
@@ -8003,46 +8335,371 @@
         <w:trPr/>
         <w:tc>
           <w:tcPr>
-            <w:tcW w:w="1310" w:type="dxa"/>
-            <w:tcBorders/>
-            <w:vAlign w:val="center"/>
-          </w:tcPr>
-          <w:p>
-            <w:pPr>
-              <w:pStyle w:val="Contenidodelatabla"/>
-              <w:bidi w:val="0"/>
-              <w:spacing w:before="0" w:after="120"/>
-              <w:jc w:val="left"/>
-              <w:rPr/>
-            </w:pPr>
-            <w:r>
-              <w:rPr/>
-              <w:t>Acción</w:t>
-            </w:r>
-          </w:p>
-        </w:tc>
-        <w:tc>
-          <w:tcPr>
-            <w:tcW w:w="8102" w:type="dxa"/>
-            <w:tcBorders/>
-            <w:vAlign w:val="center"/>
-          </w:tcPr>
-          <w:p>
-            <w:pPr>
-              <w:pStyle w:val="Contenidodelatabla"/>
-              <w:bidi w:val="0"/>
-              <w:spacing w:before="0" w:after="120"/>
-              <w:jc w:val="left"/>
-              <w:rPr/>
-            </w:pPr>
-            <w:r>
-              <w:rPr/>
-              <w:t>Botón "Entrar" alineado a la derecha</w:t>
+            <w:tcW w:w="1205" w:type="dxa"/>
+            <w:tcBorders/>
+            <w:vAlign w:val="center"/>
+          </w:tcPr>
+          <w:p>
+            <w:pPr>
+              <w:pStyle w:val="Contenidodelatabla"/>
+              <w:bidi w:val="0"/>
+              <w:spacing w:before="0" w:after="120"/>
+              <w:jc w:val="left"/>
+              <w:rPr/>
+            </w:pPr>
+            <w:r>
+              <w:rPr>
+                <w:rStyle w:val="Strong"/>
+              </w:rPr>
+              <w:t>Marca</w:t>
+            </w:r>
+            <w:r>
+              <w:rPr/>
+              <w:t>, centrada</w:t>
+            </w:r>
+          </w:p>
+        </w:tc>
+        <w:tc>
+          <w:tcPr>
+            <w:tcW w:w="8207" w:type="dxa"/>
+            <w:tcBorders/>
+            <w:vAlign w:val="center"/>
+          </w:tcPr>
+          <w:p>
+            <w:pPr>
+              <w:pStyle w:val="Contenidodelatabla"/>
+              <w:bidi w:val="0"/>
+              <w:spacing w:before="0" w:after="120"/>
+              <w:jc w:val="left"/>
+              <w:rPr/>
+            </w:pPr>
+            <w:r>
+              <w:rPr/>
+              <w:t xml:space="preserve">Icono </w:t>
+            </w:r>
+            <w:r>
+              <w:rPr>
+                <w:rStyle w:val="Textooriginal"/>
+              </w:rPr>
+              <w:t>menu_book</w:t>
+            </w:r>
+            <w:r>
+              <w:rPr/>
+              <w:t xml:space="preserve"> de 40 px en </w:t>
+            </w:r>
+            <w:r>
+              <w:rPr>
+                <w:rStyle w:val="Textooriginal"/>
+              </w:rPr>
+              <w:t>Primary</w:t>
+            </w:r>
+            <w:r>
+              <w:rPr/>
+              <w:t xml:space="preserve">; debajo las siglas </w:t>
+            </w:r>
+            <w:r>
+              <w:rPr>
+                <w:rStyle w:val="Strong"/>
+              </w:rPr>
+              <w:t>SIGBI</w:t>
+            </w:r>
+            <w:r>
+              <w:rPr/>
+              <w:t xml:space="preserve"> en </w:t>
+            </w:r>
+            <w:r>
+              <w:rPr>
+                <w:rStyle w:val="Textooriginal"/>
+              </w:rPr>
+              <w:t>Headline medium</w:t>
+            </w:r>
+            <w:r>
+              <w:rPr/>
+              <w:t xml:space="preserve"> (Lora SemiBold 28/36), </w:t>
+            </w:r>
+            <w:r>
+              <w:rPr>
+                <w:rStyle w:val="Textooriginal"/>
+              </w:rPr>
+              <w:t>On Surface</w:t>
+            </w:r>
+            <w:r>
+              <w:rPr/>
+              <w:t xml:space="preserve">; debajo </w:t>
+            </w:r>
+            <w:r>
+              <w:rPr>
+                <w:rStyle w:val="Strong"/>
+              </w:rPr>
+              <w:t>Sistema de Gestión Bibliotecaria Inteligente</w:t>
+            </w:r>
+            <w:r>
+              <w:rPr/>
+              <w:t xml:space="preserve"> en </w:t>
+            </w:r>
+            <w:r>
+              <w:rPr>
+                <w:rStyle w:val="Textooriginal"/>
+              </w:rPr>
+              <w:t>Label large</w:t>
+            </w:r>
+            <w:r>
+              <w:rPr/>
+              <w:t xml:space="preserve"> (IBM Plex Sans Medium 14/20), </w:t>
+            </w:r>
+            <w:r>
+              <w:rPr>
+                <w:rStyle w:val="Textooriginal"/>
+              </w:rPr>
+              <w:t>On Surface</w:t>
+            </w:r>
+          </w:p>
+        </w:tc>
+      </w:tr>
+      <w:tr>
+        <w:trPr/>
+        <w:tc>
+          <w:tcPr>
+            <w:tcW w:w="1205" w:type="dxa"/>
+            <w:tcBorders/>
+            <w:vAlign w:val="center"/>
+          </w:tcPr>
+          <w:p>
+            <w:pPr>
+              <w:pStyle w:val="Contenidodelatabla"/>
+              <w:bidi w:val="0"/>
+              <w:spacing w:before="0" w:after="120"/>
+              <w:jc w:val="left"/>
+              <w:rPr/>
+            </w:pPr>
+            <w:r>
+              <w:rPr/>
+              <w:t>Subtítulo</w:t>
+            </w:r>
+          </w:p>
+        </w:tc>
+        <w:tc>
+          <w:tcPr>
+            <w:tcW w:w="8207" w:type="dxa"/>
+            <w:tcBorders/>
+            <w:vAlign w:val="center"/>
+          </w:tcPr>
+          <w:p>
+            <w:pPr>
+              <w:pStyle w:val="Contenidodelatabla"/>
+              <w:bidi w:val="0"/>
+              <w:spacing w:before="0" w:after="120"/>
+              <w:jc w:val="left"/>
+              <w:rPr/>
+            </w:pPr>
+            <w:r>
+              <w:rPr/>
+              <w:t xml:space="preserve">"Ingrese sus credenciales", centrado, en </w:t>
+            </w:r>
+            <w:r>
+              <w:rPr>
+                <w:rStyle w:val="Textooriginal"/>
+              </w:rPr>
+              <w:t>Body medium</w:t>
+            </w:r>
+            <w:r>
+              <w:rPr/>
+              <w:t xml:space="preserve"> (Regular 14/20), </w:t>
+            </w:r>
+            <w:r>
+              <w:rPr>
+                <w:rStyle w:val="Textooriginal"/>
+              </w:rPr>
+              <w:t>On Surface Variant</w:t>
             </w:r>
           </w:p>
         </w:tc>
       </w:tr>
     </w:tbl>
+    <w:p>
+      <w:pPr>
+        <w:pStyle w:val="BodyText"/>
+        <w:bidi w:val="0"/>
+        <w:rPr/>
+      </w:pPr>
+      <w:r>
+        <w:rPr>
+          <w:rStyle w:val="Strong"/>
+        </w:rPr>
+        <w:t>Los tres bloques salen de la escala de sección 2.5, y ninguno lleva un tamaño escrito a mano.</w:t>
+      </w:r>
+      <w:r>
+        <w:rPr/>
+        <w:t xml:space="preserve"> El nombre del sistema y el subtítulo comparten cuerpo -14/20-: la jerarquía entre ellos la hacen el </w:t>
+      </w:r>
+      <w:r>
+        <w:rPr>
+          <w:rStyle w:val="Strong"/>
+        </w:rPr>
+        <w:t>peso</w:t>
+      </w:r>
+      <w:r>
+        <w:rPr/>
+        <w:t xml:space="preserve"> (Medium frente a Regular) y el </w:t>
+      </w:r>
+      <w:r>
+        <w:rPr>
+          <w:rStyle w:val="Strong"/>
+        </w:rPr>
+        <w:t>color</w:t>
+      </w:r>
+      <w:r>
+        <w:rPr/>
+        <w:t xml:space="preserve"> (</w:t>
+      </w:r>
+      <w:r>
+        <w:rPr>
+          <w:rStyle w:val="Textooriginal"/>
+        </w:rPr>
+        <w:t>On Surface</w:t>
+      </w:r>
+      <w:r>
+        <w:rPr/>
+        <w:t xml:space="preserve"> frente a </w:t>
+      </w:r>
+      <w:r>
+        <w:rPr>
+          <w:rStyle w:val="Textooriginal"/>
+        </w:rPr>
+        <w:t>On Surface Variant</w:t>
+      </w:r>
+      <w:r>
+        <w:rPr/>
+        <w:t>), no un tamaño menor inventado para la ocasión.</w:t>
+      </w:r>
+    </w:p>
+    <w:p>
+      <w:pPr>
+        <w:pStyle w:val="BodyText"/>
+        <w:bidi w:val="0"/>
+        <w:rPr/>
+      </w:pPr>
+      <w:r>
+        <w:rPr>
+          <w:rStyle w:val="Strong"/>
+        </w:rPr>
+        <w:t>Por qué 14 y no 16.</w:t>
+      </w:r>
+      <w:r>
+        <w:rPr/>
+        <w:t xml:space="preserve"> Medido con IBM Plex Sans sobre la aplicación en ejecución: en un teléfono de 360 px la tarjeta deja </w:t>
+      </w:r>
+      <w:r>
+        <w:rPr>
+          <w:rStyle w:val="Strong"/>
+        </w:rPr>
+        <w:t>296 px</w:t>
+      </w:r>
+      <w:r>
+        <w:rPr/>
+        <w:t xml:space="preserve"> interiores, y el nombre ocupa </w:t>
+      </w:r>
+      <w:r>
+        <w:rPr>
+          <w:rStyle w:val="Strong"/>
+        </w:rPr>
+        <w:t>282 px a 14 px</w:t>
+      </w:r>
+      <w:r>
+        <w:rPr/>
+        <w:t xml:space="preserve"> -una línea, con holgura- frente a </w:t>
+      </w:r>
+      <w:r>
+        <w:rPr>
+          <w:rStyle w:val="Strong"/>
+        </w:rPr>
+        <w:t>315 px a 16 px</w:t>
+      </w:r>
+      <w:r>
+        <w:rPr/>
+        <w:t xml:space="preserve">, que se parte en dos. El siguiente paso de la escala no cabe. | Correo | Campo relleno. </w:t>
+      </w:r>
+      <w:r>
+        <w:rPr>
+          <w:rStyle w:val="Textooriginal"/>
+        </w:rPr>
+        <w:t>type="email"</w:t>
+      </w:r>
+      <w:r>
+        <w:rPr/>
+        <w:t xml:space="preserve"> con </w:t>
+      </w:r>
+      <w:r>
+        <w:rPr>
+          <w:rStyle w:val="Textooriginal"/>
+        </w:rPr>
+        <w:t>inputmode="email"</w:t>
+      </w:r>
+      <w:r>
+        <w:rPr/>
+        <w:t xml:space="preserve">, </w:t>
+      </w:r>
+      <w:r>
+        <w:rPr>
+          <w:rStyle w:val="Textooriginal"/>
+        </w:rPr>
+        <w:t>autocapitalize="none"</w:t>
+      </w:r>
+      <w:r>
+        <w:rPr/>
+        <w:t xml:space="preserve">, </w:t>
+      </w:r>
+      <w:r>
+        <w:rPr>
+          <w:rStyle w:val="Textooriginal"/>
+        </w:rPr>
+        <w:t>autocorrect="off"</w:t>
+      </w:r>
+      <w:r>
+        <w:rPr/>
+        <w:t xml:space="preserve"> y </w:t>
+      </w:r>
+      <w:r>
+        <w:rPr>
+          <w:rStyle w:val="Textooriginal"/>
+        </w:rPr>
+        <w:t>spellcheck="false"</w:t>
+      </w:r>
+      <w:r>
+        <w:rPr/>
+        <w:t xml:space="preserve"> | | Contraseña | Campo relleno con </w:t>
+      </w:r>
+      <w:r>
+        <w:rPr>
+          <w:rStyle w:val="Strong"/>
+        </w:rPr>
+        <w:t>conmutador de visibilidad</w:t>
+      </w:r>
+      <w:r>
+        <w:rPr/>
+        <w:t xml:space="preserve"> al final (</w:t>
+      </w:r>
+      <w:r>
+        <w:rPr>
+          <w:rStyle w:val="Textooriginal"/>
+        </w:rPr>
+        <w:t>visibility</w:t>
+      </w:r>
+      <w:r>
+        <w:rPr/>
+        <w:t xml:space="preserve"> / </w:t>
+      </w:r>
+      <w:r>
+        <w:rPr>
+          <w:rStyle w:val="Textooriginal"/>
+        </w:rPr>
+        <w:t>visibility_off</w:t>
+      </w:r>
+      <w:r>
+        <w:rPr/>
+        <w:t>) | | Acción | Botón "Entrar" alineado a la derecha |</w:t>
+      </w:r>
+    </w:p>
     <w:p>
       <w:pPr>
         <w:pStyle w:val="BodyText"/>

</xml_diff>